<commit_message>
Deploying to gh-pages from @ Morrison-Lab/mds@42c0c9992b4e3b445f0998312defabe1f5d43972 🚀
</commit_message>
<xml_diff>
--- a/algebra-trigonometry.docx
+++ b/algebra-trigonometry.docx
@@ -15,10 +15,10 @@
         <w:pStyle w:val="Date"/>
       </w:pPr>
       <w:r>
-        <w:t xml:space="preserve">Last modified: 2026-10-15 23:56:47 (PDT)</w:t>
+        <w:t xml:space="preserve">Last modified: 2026-10-16 01:00:03 (PDT)</w:t>
       </w:r>
     </w:p>
-    <w:bookmarkStart w:id="18" w:name="sec-cosine-sine"/>
+    <w:bookmarkStart w:id="24" w:name="sec-cosine-sine"/>
     <w:p>
       <w:pPr>
         <w:pStyle w:val="Heading2"/>
@@ -27,7 +27,7 @@
         <w:t xml:space="preserve">1 Cosine and sine</w:t>
       </w:r>
     </w:p>
-    <w:bookmarkStart w:id="9" w:name="def-cosine-sine"/>
+    <w:bookmarkStart w:id="9" w:name="def-unit-circle"/>
     <w:p>
       <w:pPr>
         <w:pStyle w:val="FirstParagraph"/>
@@ -37,7 +37,7 @@
           <w:b/>
           <w:bCs/>
         </w:rPr>
-        <w:t xml:space="preserve">Definition 1 (Cosine and sine)</w:t>
+        <w:t xml:space="preserve">Definition 1 (Unit circle)</w:t>
       </w:r>
       <w:r>
         <w:t xml:space="preserve"> </w:t>
@@ -50,8 +50,8 @@
       </w:r>
       <w:r>
         <w:rPr>
-          <w:i/>
-          <w:iCs/>
+          <w:b/>
+          <w:bCs/>
         </w:rPr>
         <w:t xml:space="preserve">unit circle</w:t>
       </w:r>
@@ -169,13 +169,718 @@
         </m:r>
       </m:oMath>
       <w:r>
+        <w:t xml:space="preserve">.</w:t>
+      </w:r>
+    </w:p>
+    <w:bookmarkEnd w:id="9"/>
+    <w:bookmarkStart w:id="10" w:name="exm-unit-circle"/>
+    <w:p>
+      <w:pPr>
+        <w:pStyle w:val="BodyText"/>
+      </w:pPr>
+      <w:r>
+        <w:rPr>
+          <w:b/>
+          <w:bCs/>
+        </w:rPr>
+        <w:t xml:space="preserve">Example 1 (Points on the unit circle)</w:t>
+      </w:r>
+      <w:r>
+        <w:t xml:space="preserve"> </w:t>
+      </w:r>
+      <w:r>
+        <w:t xml:space="preserve"> </w:t>
+      </w:r>
+    </w:p>
+    <w:p>
+      <w:pPr>
+        <w:pStyle w:val="Compact"/>
+        <w:numPr>
+          <w:ilvl w:val="0"/>
+          <w:numId w:val="1001"/>
+        </w:numPr>
+      </w:pPr>
+      <m:oMath>
+        <m:r>
+          <m:rPr>
+            <m:sty m:val="p"/>
+          </m:rPr>
+          <m:t>(</m:t>
+        </m:r>
+        <m:r>
+          <m:t>1</m:t>
+        </m:r>
+        <m:r>
+          <m:rPr>
+            <m:sty m:val="p"/>
+          </m:rPr>
+          <m:t>,</m:t>
+        </m:r>
+        <m:r>
+          <m:t>0</m:t>
+        </m:r>
+        <m:r>
+          <m:rPr>
+            <m:sty m:val="p"/>
+          </m:rPr>
+          <m:t>)</m:t>
+        </m:r>
+      </m:oMath>
+      <w:r>
+        <w:t xml:space="preserve"> </w:t>
+      </w:r>
+      <w:r>
+        <w:t xml:space="preserve">is on the unit circle, because</w:t>
+      </w:r>
+      <w:r>
+        <w:t xml:space="preserve"> </w:t>
+      </w:r>
+      <m:oMath>
+        <m:sSup>
+          <m:e>
+            <m:r>
+              <m:t>1</m:t>
+            </m:r>
+          </m:e>
+          <m:sup>
+            <m:r>
+              <m:t>2</m:t>
+            </m:r>
+          </m:sup>
+        </m:sSup>
+        <m:r>
+          <m:rPr>
+            <m:sty m:val="p"/>
+          </m:rPr>
+          <m:t>+</m:t>
+        </m:r>
+        <m:sSup>
+          <m:e>
+            <m:r>
+              <m:t>0</m:t>
+            </m:r>
+          </m:e>
+          <m:sup>
+            <m:r>
+              <m:t>2</m:t>
+            </m:r>
+          </m:sup>
+        </m:sSup>
+        <m:r>
+          <m:rPr>
+            <m:sty m:val="p"/>
+          </m:rPr>
+          <m:t>=</m:t>
+        </m:r>
+        <m:r>
+          <m:t>1</m:t>
+        </m:r>
+      </m:oMath>
+      <w:r>
+        <w:t xml:space="preserve">.</w:t>
+      </w:r>
+    </w:p>
+    <w:p>
+      <w:pPr>
+        <w:pStyle w:val="Compact"/>
+        <w:numPr>
+          <w:ilvl w:val="0"/>
+          <w:numId w:val="1001"/>
+        </w:numPr>
+      </w:pPr>
+      <m:oMath>
+        <m:r>
+          <m:rPr>
+            <m:sty m:val="p"/>
+          </m:rPr>
+          <m:t>(</m:t>
+        </m:r>
+        <m:r>
+          <m:t>0</m:t>
+        </m:r>
+        <m:r>
+          <m:rPr>
+            <m:sty m:val="p"/>
+          </m:rPr>
+          <m:t>,</m:t>
+        </m:r>
+        <m:r>
+          <m:rPr>
+            <m:sty m:val="p"/>
+          </m:rPr>
+          <m:t>−</m:t>
+        </m:r>
+        <m:r>
+          <m:t>1</m:t>
+        </m:r>
+        <m:r>
+          <m:rPr>
+            <m:sty m:val="p"/>
+          </m:rPr>
+          <m:t>)</m:t>
+        </m:r>
+      </m:oMath>
+      <w:r>
+        <w:t xml:space="preserve"> </w:t>
+      </w:r>
+      <w:r>
+        <w:t xml:space="preserve">is on the unit circle, because</w:t>
+      </w:r>
+      <w:r>
+        <w:t xml:space="preserve"> </w:t>
+      </w:r>
+      <m:oMath>
+        <m:sSup>
+          <m:e>
+            <m:r>
+              <m:t>0</m:t>
+            </m:r>
+          </m:e>
+          <m:sup>
+            <m:r>
+              <m:t>2</m:t>
+            </m:r>
+          </m:sup>
+        </m:sSup>
+        <m:r>
+          <m:rPr>
+            <m:sty m:val="p"/>
+          </m:rPr>
+          <m:t>+</m:t>
+        </m:r>
+        <m:r>
+          <m:rPr>
+            <m:sty m:val="p"/>
+          </m:rPr>
+          <m:t>(</m:t>
+        </m:r>
+        <m:r>
+          <m:rPr>
+            <m:sty m:val="p"/>
+          </m:rPr>
+          <m:t>−</m:t>
+        </m:r>
+        <m:r>
+          <m:t>1</m:t>
+        </m:r>
+        <m:sSup>
+          <m:e>
+            <m:r>
+              <m:rPr>
+                <m:sty m:val="p"/>
+              </m:rPr>
+              <m:t>)</m:t>
+            </m:r>
+          </m:e>
+          <m:sup>
+            <m:r>
+              <m:t>2</m:t>
+            </m:r>
+          </m:sup>
+        </m:sSup>
+        <m:r>
+          <m:rPr>
+            <m:sty m:val="p"/>
+          </m:rPr>
+          <m:t>=</m:t>
+        </m:r>
+        <m:r>
+          <m:t>1</m:t>
+        </m:r>
+      </m:oMath>
+      <w:r>
+        <w:t xml:space="preserve">.</w:t>
+      </w:r>
+    </w:p>
+    <w:p>
+      <w:pPr>
+        <w:pStyle w:val="Compact"/>
+        <w:numPr>
+          <w:ilvl w:val="0"/>
+          <w:numId w:val="1001"/>
+        </w:numPr>
+      </w:pPr>
+      <m:oMath>
+        <m:r>
+          <m:rPr>
+            <m:sty m:val="p"/>
+          </m:rPr>
+          <m:t>(</m:t>
+        </m:r>
+        <m:f>
+          <m:fPr>
+            <m:type m:val="lin"/>
+          </m:fPr>
+          <m:num>
+            <m:r>
+              <m:t>3</m:t>
+            </m:r>
+          </m:num>
+          <m:den>
+            <m:r>
+              <m:t>5</m:t>
+            </m:r>
+          </m:den>
+        </m:f>
+        <m:r>
+          <m:rPr>
+            <m:sty m:val="p"/>
+          </m:rPr>
+          <m:t>,</m:t>
+        </m:r>
+        <m:f>
+          <m:fPr>
+            <m:type m:val="lin"/>
+          </m:fPr>
+          <m:num>
+            <m:r>
+              <m:t>4</m:t>
+            </m:r>
+          </m:num>
+          <m:den>
+            <m:r>
+              <m:t>5</m:t>
+            </m:r>
+          </m:den>
+        </m:f>
+        <m:r>
+          <m:rPr>
+            <m:sty m:val="p"/>
+          </m:rPr>
+          <m:t>)</m:t>
+        </m:r>
+      </m:oMath>
+      <w:r>
+        <w:t xml:space="preserve"> </w:t>
+      </w:r>
+      <w:r>
+        <w:t xml:space="preserve">is on the unit circle, because</w:t>
+      </w:r>
+      <w:r>
+        <w:t xml:space="preserve"> </w:t>
+      </w:r>
+      <m:oMath>
+        <m:f>
+          <m:fPr>
+            <m:type m:val="lin"/>
+          </m:fPr>
+          <m:num>
+            <m:r>
+              <m:t>9</m:t>
+            </m:r>
+          </m:num>
+          <m:den>
+            <m:r>
+              <m:t>25</m:t>
+            </m:r>
+          </m:den>
+        </m:f>
+        <m:r>
+          <m:rPr>
+            <m:sty m:val="p"/>
+          </m:rPr>
+          <m:t>+</m:t>
+        </m:r>
+        <m:f>
+          <m:fPr>
+            <m:type m:val="lin"/>
+          </m:fPr>
+          <m:num>
+            <m:r>
+              <m:t>16</m:t>
+            </m:r>
+          </m:num>
+          <m:den>
+            <m:r>
+              <m:t>25</m:t>
+            </m:r>
+          </m:den>
+        </m:f>
+        <m:r>
+          <m:rPr>
+            <m:sty m:val="p"/>
+          </m:rPr>
+          <m:t>=</m:t>
+        </m:r>
+        <m:r>
+          <m:t>1</m:t>
+        </m:r>
+      </m:oMath>
+      <w:r>
+        <w:t xml:space="preserve">.</w:t>
+      </w:r>
+    </w:p>
+    <w:p>
+      <w:pPr>
+        <w:pStyle w:val="Compact"/>
+        <w:numPr>
+          <w:ilvl w:val="0"/>
+          <w:numId w:val="1001"/>
+        </w:numPr>
+      </w:pPr>
+      <m:oMath>
+        <m:r>
+          <m:rPr>
+            <m:sty m:val="p"/>
+          </m:rPr>
+          <m:t>(</m:t>
+        </m:r>
+        <m:r>
+          <m:t>1</m:t>
+        </m:r>
+        <m:r>
+          <m:rPr>
+            <m:sty m:val="p"/>
+          </m:rPr>
+          <m:t>,</m:t>
+        </m:r>
+        <m:r>
+          <m:t>1</m:t>
+        </m:r>
+        <m:r>
+          <m:rPr>
+            <m:sty m:val="p"/>
+          </m:rPr>
+          <m:t>)</m:t>
+        </m:r>
+      </m:oMath>
+      <w:r>
+        <w:t xml:space="preserve"> </w:t>
+      </w:r>
+      <w:r>
+        <w:t xml:space="preserve">is not on the unit circle, because</w:t>
+      </w:r>
+      <w:r>
+        <w:t xml:space="preserve"> </w:t>
+      </w:r>
+      <m:oMath>
+        <m:sSup>
+          <m:e>
+            <m:r>
+              <m:t>1</m:t>
+            </m:r>
+          </m:e>
+          <m:sup>
+            <m:r>
+              <m:t>2</m:t>
+            </m:r>
+          </m:sup>
+        </m:sSup>
+        <m:r>
+          <m:rPr>
+            <m:sty m:val="p"/>
+          </m:rPr>
+          <m:t>+</m:t>
+        </m:r>
+        <m:sSup>
+          <m:e>
+            <m:r>
+              <m:t>1</m:t>
+            </m:r>
+          </m:e>
+          <m:sup>
+            <m:r>
+              <m:t>2</m:t>
+            </m:r>
+          </m:sup>
+        </m:sSup>
+        <m:r>
+          <m:rPr>
+            <m:sty m:val="p"/>
+          </m:rPr>
+          <m:t>=</m:t>
+        </m:r>
+        <m:r>
+          <m:t>2</m:t>
+        </m:r>
+        <m:r>
+          <m:rPr>
+            <m:sty m:val="p"/>
+          </m:rPr>
+          <m:t>≠</m:t>
+        </m:r>
+        <m:r>
+          <m:t>1</m:t>
+        </m:r>
+      </m:oMath>
+      <w:r>
+        <w:t xml:space="preserve">.</w:t>
+      </w:r>
+    </w:p>
+    <w:bookmarkEnd w:id="10"/>
+    <w:bookmarkStart w:id="11" w:name="def-pi"/>
+    <w:p>
+      <w:pPr>
+        <w:pStyle w:val="FirstParagraph"/>
+      </w:pPr>
+      <w:r>
+        <w:rPr>
+          <w:b/>
+          <w:bCs/>
+        </w:rPr>
+        <w:t xml:space="preserve">Definition 2 (The number</w:t>
+      </w:r>
+      <w:r>
+        <w:rPr>
+          <w:b/>
+          <w:bCs/>
+        </w:rPr>
+        <w:t xml:space="preserve"> </w:t>
+      </w:r>
+      <m:oMath>
+        <m:r>
+          <m:t>π</m:t>
+        </m:r>
+      </m:oMath>
+      <w:r>
+        <w:rPr>
+          <w:b/>
+          <w:bCs/>
+        </w:rPr>
+        <w:t xml:space="preserve">)</w:t>
+      </w:r>
+      <w:r>
+        <w:t xml:space="preserve"> </w:t>
+      </w:r>
+      <w:r>
+        <w:t xml:space="preserve">The number</w:t>
+      </w:r>
+      <w:r>
+        <w:t xml:space="preserve"> </w:t>
+      </w:r>
+      <m:oMath>
+        <m:r>
+          <m:t>π</m:t>
+        </m:r>
+        <m:r>
+          <m:rPr>
+            <m:sty m:val="p"/>
+          </m:rPr>
+          <m:t>≈</m:t>
+        </m:r>
+        <m:r>
+          <m:t>3.14159</m:t>
+        </m:r>
+      </m:oMath>
+      <w:r>
+        <w:t xml:space="preserve"> </w:t>
+      </w:r>
+      <w:r>
+        <w:t xml:space="preserve">is half of the circumference of the unit circle (</w:t>
+      </w:r>
+      <w:hyperlink w:anchor="def-unit-circle">
+        <w:r>
+          <w:rPr>
+            <w:rStyle w:val="Hyperlink"/>
+          </w:rPr>
+          <w:t xml:space="preserve">Definition 1</w:t>
+        </w:r>
+      </w:hyperlink>
+      <w:r>
+        <w:t xml:space="preserve">).</w:t>
+      </w:r>
+    </w:p>
+    <w:bookmarkEnd w:id="11"/>
+    <w:bookmarkStart w:id="12" w:name="exm-pi"/>
+    <w:p>
+      <w:pPr>
+        <w:pStyle w:val="BodyText"/>
+      </w:pPr>
+      <w:r>
+        <w:rPr>
+          <w:b/>
+          <w:bCs/>
+        </w:rPr>
+        <w:t xml:space="preserve">Example 2 (Distances around the unit circle)</w:t>
+      </w:r>
+      <w:r>
+        <w:t xml:space="preserve"> </w:t>
+      </w:r>
+      <w:r>
+        <w:t xml:space="preserve">The whole unit circle has circumference</w:t>
+      </w:r>
+      <w:r>
+        <w:t xml:space="preserve"> </w:t>
+      </w:r>
+      <m:oMath>
+        <m:r>
+          <m:t>2</m:t>
+        </m:r>
+        <m:r>
+          <m:t>π</m:t>
+        </m:r>
+      </m:oMath>
+      <w:r>
+        <w:t xml:space="preserve">.</w:t>
+      </w:r>
+      <w:r>
+        <w:t xml:space="preserve"> </w:t>
+      </w:r>
+      <w:r>
+        <w:t xml:space="preserve">Moving from</w:t>
+      </w:r>
+      <w:r>
+        <w:t xml:space="preserve"> </w:t>
+      </w:r>
+      <m:oMath>
+        <m:r>
+          <m:rPr>
+            <m:sty m:val="p"/>
+          </m:rPr>
+          <m:t>(</m:t>
+        </m:r>
+        <m:r>
+          <m:t>1</m:t>
+        </m:r>
+        <m:r>
+          <m:rPr>
+            <m:sty m:val="p"/>
+          </m:rPr>
+          <m:t>,</m:t>
+        </m:r>
+        <m:r>
+          <m:t>0</m:t>
+        </m:r>
+        <m:r>
+          <m:rPr>
+            <m:sty m:val="p"/>
+          </m:rPr>
+          <m:t>)</m:t>
+        </m:r>
+      </m:oMath>
+      <w:r>
+        <w:t xml:space="preserve"> </w:t>
+      </w:r>
+      <w:r>
+        <w:t xml:space="preserve">to</w:t>
+      </w:r>
+      <w:r>
+        <w:t xml:space="preserve"> </w:t>
+      </w:r>
+      <m:oMath>
+        <m:r>
+          <m:rPr>
+            <m:sty m:val="p"/>
+          </m:rPr>
+          <m:t>(</m:t>
+        </m:r>
+        <m:r>
+          <m:rPr>
+            <m:sty m:val="p"/>
+          </m:rPr>
+          <m:t>−</m:t>
+        </m:r>
+        <m:r>
+          <m:t>1</m:t>
+        </m:r>
+        <m:r>
+          <m:rPr>
+            <m:sty m:val="p"/>
+          </m:rPr>
+          <m:t>,</m:t>
+        </m:r>
+        <m:r>
+          <m:t>0</m:t>
+        </m:r>
+        <m:r>
+          <m:rPr>
+            <m:sty m:val="p"/>
+          </m:rPr>
+          <m:t>)</m:t>
+        </m:r>
+      </m:oMath>
+      <w:r>
+        <w:t xml:space="preserve"> </w:t>
+      </w:r>
+      <w:r>
+        <w:t xml:space="preserve">along the upper half of the circle covers a distance of</w:t>
+      </w:r>
+      <w:r>
+        <w:t xml:space="preserve"> </w:t>
+      </w:r>
+      <m:oMath>
+        <m:r>
+          <m:t>π</m:t>
+        </m:r>
+      </m:oMath>
+      <w:r>
         <w:t xml:space="preserve">,</w:t>
       </w:r>
       <w:r>
         <w:t xml:space="preserve"> </w:t>
       </w:r>
       <w:r>
-        <w:t xml:space="preserve">and</w:t>
+        <w:t xml:space="preserve">and moving from</w:t>
+      </w:r>
+      <w:r>
+        <w:t xml:space="preserve"> </w:t>
+      </w:r>
+      <m:oMath>
+        <m:r>
+          <m:rPr>
+            <m:sty m:val="p"/>
+          </m:rPr>
+          <m:t>(</m:t>
+        </m:r>
+        <m:r>
+          <m:t>1</m:t>
+        </m:r>
+        <m:r>
+          <m:rPr>
+            <m:sty m:val="p"/>
+          </m:rPr>
+          <m:t>,</m:t>
+        </m:r>
+        <m:r>
+          <m:t>0</m:t>
+        </m:r>
+        <m:r>
+          <m:rPr>
+            <m:sty m:val="p"/>
+          </m:rPr>
+          <m:t>)</m:t>
+        </m:r>
+      </m:oMath>
+      <w:r>
+        <w:t xml:space="preserve"> </w:t>
+      </w:r>
+      <w:r>
+        <w:t xml:space="preserve">to</w:t>
+      </w:r>
+      <w:r>
+        <w:t xml:space="preserve"> </w:t>
+      </w:r>
+      <m:oMath>
+        <m:r>
+          <m:rPr>
+            <m:sty m:val="p"/>
+          </m:rPr>
+          <m:t>(</m:t>
+        </m:r>
+        <m:r>
+          <m:t>0</m:t>
+        </m:r>
+        <m:r>
+          <m:rPr>
+            <m:sty m:val="p"/>
+          </m:rPr>
+          <m:t>,</m:t>
+        </m:r>
+        <m:r>
+          <m:t>1</m:t>
+        </m:r>
+        <m:r>
+          <m:rPr>
+            <m:sty m:val="p"/>
+          </m:rPr>
+          <m:t>)</m:t>
+        </m:r>
+      </m:oMath>
+      <w:r>
+        <w:t xml:space="preserve"> </w:t>
+      </w:r>
+      <w:r>
+        <w:t xml:space="preserve">covers a quarter of the circle, a distance of</w:t>
       </w:r>
       <w:r>
         <w:t xml:space="preserve"> </w:t>
@@ -188,17 +893,28 @@
           <m:rPr>
             <m:sty m:val="p"/>
           </m:rPr>
-          <m:t>≈</m:t>
-        </m:r>
-        <m:r>
-          <m:t>3.14159</m:t>
-        </m:r>
-      </m:oMath>
-      <w:r>
-        <w:t xml:space="preserve"> </w:t>
-      </w:r>
-      <w:r>
-        <w:t xml:space="preserve">is half of its circumference.</w:t>
+          <m:t>/</m:t>
+        </m:r>
+        <m:r>
+          <m:t>2</m:t>
+        </m:r>
+      </m:oMath>
+      <w:r>
+        <w:t xml:space="preserve">.</w:t>
+      </w:r>
+    </w:p>
+    <w:bookmarkEnd w:id="12"/>
+    <w:bookmarkStart w:id="13" w:name="def-cosine-sine"/>
+    <w:p>
+      <w:pPr>
+        <w:pStyle w:val="BodyText"/>
+      </w:pPr>
+      <w:r>
+        <w:rPr>
+          <w:b/>
+          <w:bCs/>
+        </w:rPr>
+        <w:t xml:space="preserve">Definition 3 (Cosine)</w:t>
       </w:r>
       <w:r>
         <w:t xml:space="preserve"> </w:t>
@@ -246,6 +962,23 @@
           <m:t>)</m:t>
         </m:r>
       </m:oMath>
+      <w:r>
+        <w:t xml:space="preserve"> </w:t>
+      </w:r>
+      <w:r>
+        <w:t xml:space="preserve">of the unit circle (</w:t>
+      </w:r>
+      <w:hyperlink w:anchor="def-unit-circle">
+        <w:r>
+          <w:rPr>
+            <w:rStyle w:val="Hyperlink"/>
+          </w:rPr>
+          <w:t xml:space="preserve">Definition 1</w:t>
+        </w:r>
+      </w:hyperlink>
+      <w:r>
+        <w:t xml:space="preserve">)</w:t>
+      </w:r>
       <w:r>
         <w:t xml:space="preserve"> </w:t>
       </w:r>
@@ -280,7 +1013,7 @@
         <w:t xml:space="preserve"> </w:t>
       </w:r>
       <w:r>
-        <w:t xml:space="preserve">along the unit circle,</w:t>
+        <w:t xml:space="preserve">along the circle,</w:t>
       </w:r>
       <w:r>
         <w:t xml:space="preserve"> </w:t>
@@ -335,57 +1068,7 @@
         <w:t xml:space="preserve"> </w:t>
       </w:r>
       <w:r>
-        <w:t xml:space="preserve">The point reached is</w:t>
-      </w:r>
-      <w:r>
-        <w:t xml:space="preserve"> </w:t>
-      </w:r>
-      <m:oMath>
-        <m:r>
-          <m:rPr>
-            <m:sty m:val="p"/>
-          </m:rPr>
-          <m:t>(</m:t>
-        </m:r>
-        <m:r>
-          <m:rPr>
-            <m:sty m:val="p"/>
-          </m:rPr>
-          <m:t>cos</m:t>
-        </m:r>
-        <m:r>
-          <m:t>θ</m:t>
-        </m:r>
-        <m:r>
-          <m:rPr>
-            <m:sty m:val="p"/>
-          </m:rPr>
-          <m:t>,</m:t>
-        </m:r>
-        <m:r>
-          <m:rPr>
-            <m:sty m:val="p"/>
-          </m:rPr>
-          <m:t>sin</m:t>
-        </m:r>
-        <m:r>
-          <m:t>θ</m:t>
-        </m:r>
-        <m:r>
-          <m:rPr>
-            <m:sty m:val="p"/>
-          </m:rPr>
-          <m:t>)</m:t>
-        </m:r>
-      </m:oMath>
-      <w:r>
-        <w:t xml:space="preserve">:</w:t>
-      </w:r>
-      <w:r>
-        <w:t xml:space="preserve"> </w:t>
-      </w:r>
-      <w:r>
-        <w:t xml:space="preserve">its first coordinate is the</w:t>
+        <w:t xml:space="preserve">The first coordinate of the point reached is the</w:t>
       </w:r>
       <w:r>
         <w:t xml:space="preserve"> </w:t>
@@ -412,54 +1095,38 @@
         </m:r>
       </m:oMath>
       <w:r>
-        <w:t xml:space="preserve">,</w:t>
-      </w:r>
-      <w:r>
-        <w:t xml:space="preserve"> </w:t>
-      </w:r>
-      <w:r>
-        <w:t xml:space="preserve">and its second coordinate is the</w:t>
-      </w:r>
-      <w:r>
-        <w:t xml:space="preserve"> </w:t>
-      </w:r>
+        <w:t xml:space="preserve">, written</w:t>
+      </w:r>
+      <w:r>
+        <w:t xml:space="preserve"> </w:t>
+      </w:r>
+      <m:oMath>
+        <m:r>
+          <m:rPr>
+            <m:sty m:val="p"/>
+          </m:rPr>
+          <m:t>cos</m:t>
+        </m:r>
+        <m:r>
+          <m:t>θ</m:t>
+        </m:r>
+      </m:oMath>
+      <w:r>
+        <w:t xml:space="preserve">.</w:t>
+      </w:r>
+    </w:p>
+    <w:bookmarkEnd w:id="13"/>
+    <w:bookmarkStart w:id="14" w:name="exm-cosine-sine"/>
+    <w:p>
+      <w:pPr>
+        <w:pStyle w:val="BodyText"/>
+      </w:pPr>
       <w:r>
         <w:rPr>
           <w:b/>
           <w:bCs/>
         </w:rPr>
-        <w:t xml:space="preserve">sine</w:t>
-      </w:r>
-      <w:r>
-        <w:t xml:space="preserve"> </w:t>
-      </w:r>
-      <w:r>
-        <w:t xml:space="preserve">of</w:t>
-      </w:r>
-      <w:r>
-        <w:t xml:space="preserve"> </w:t>
-      </w:r>
-      <m:oMath>
-        <m:r>
-          <m:t>θ</m:t>
-        </m:r>
-      </m:oMath>
-      <w:r>
-        <w:t xml:space="preserve">.</w:t>
-      </w:r>
-    </w:p>
-    <w:bookmarkEnd w:id="9"/>
-    <w:bookmarkStart w:id="10" w:name="exm-cosine-sine"/>
-    <w:p>
-      <w:pPr>
-        <w:pStyle w:val="BodyText"/>
-      </w:pPr>
-      <w:r>
-        <w:rPr>
-          <w:b/>
-          <w:bCs/>
-        </w:rPr>
-        <w:t xml:space="preserve">Example 1 (Cosines and sines of some angles)</w:t>
+        <w:t xml:space="preserve">Example 3 (Cosines of some angles)</w:t>
       </w:r>
       <w:r>
         <w:t xml:space="preserve"> </w:t>
@@ -470,9 +1137,10 @@
     </w:p>
     <w:p>
       <w:pPr>
+        <w:pStyle w:val="Compact"/>
         <w:numPr>
           <w:ilvl w:val="0"/>
-          <w:numId w:val="1001"/>
+          <w:numId w:val="1002"/>
         </w:numPr>
       </w:pPr>
       <m:oMath>
@@ -548,35 +1216,6 @@
         </m:r>
         <m:r>
           <m:t>1</m:t>
-        </m:r>
-      </m:oMath>
-      <w:r>
-        <w:t xml:space="preserve"> </w:t>
-      </w:r>
-      <w:r>
-        <w:t xml:space="preserve">and</w:t>
-      </w:r>
-      <w:r>
-        <w:t xml:space="preserve"> </w:t>
-      </w:r>
-      <m:oMath>
-        <m:r>
-          <m:rPr>
-            <m:sty m:val="p"/>
-          </m:rPr>
-          <m:t>sin</m:t>
-        </m:r>
-        <m:r>
-          <m:t>0</m:t>
-        </m:r>
-        <m:r>
-          <m:rPr>
-            <m:sty m:val="p"/>
-          </m:rPr>
-          <m:t>=</m:t>
-        </m:r>
-        <m:r>
-          <m:t>0</m:t>
         </m:r>
       </m:oMath>
       <w:r>
@@ -585,9 +1224,10 @@
     </w:p>
     <w:p>
       <w:pPr>
+        <w:pStyle w:val="Compact"/>
         <w:numPr>
           <w:ilvl w:val="0"/>
-          <w:numId w:val="1001"/>
+          <w:numId w:val="1002"/>
         </w:numPr>
       </w:pPr>
       <m:oMath>
@@ -646,13 +1286,7 @@
         </m:r>
       </m:oMath>
       <w:r>
-        <w:t xml:space="preserve">,</w:t>
-      </w:r>
-      <w:r>
-        <w:t xml:space="preserve"> </w:t>
-      </w:r>
-      <w:r>
-        <w:t xml:space="preserve">so</w:t>
+        <w:t xml:space="preserve">, so</w:t>
       </w:r>
       <w:r>
         <w:t xml:space="preserve"> </w:t>
@@ -681,35 +1315,6 @@
         </m:r>
         <m:r>
           <m:t>1</m:t>
-        </m:r>
-      </m:oMath>
-      <w:r>
-        <w:t xml:space="preserve"> </w:t>
-      </w:r>
-      <w:r>
-        <w:t xml:space="preserve">and</w:t>
-      </w:r>
-      <w:r>
-        <w:t xml:space="preserve"> </w:t>
-      </w:r>
-      <m:oMath>
-        <m:r>
-          <m:rPr>
-            <m:sty m:val="p"/>
-          </m:rPr>
-          <m:t>sin</m:t>
-        </m:r>
-        <m:r>
-          <m:t>π</m:t>
-        </m:r>
-        <m:r>
-          <m:rPr>
-            <m:sty m:val="p"/>
-          </m:rPr>
-          <m:t>=</m:t>
-        </m:r>
-        <m:r>
-          <m:t>0</m:t>
         </m:r>
       </m:oMath>
       <w:r>
@@ -718,9 +1323,10 @@
     </w:p>
     <w:p>
       <w:pPr>
+        <w:pStyle w:val="Compact"/>
         <w:numPr>
           <w:ilvl w:val="0"/>
-          <w:numId w:val="1001"/>
+          <w:numId w:val="1002"/>
         </w:numPr>
       </w:pPr>
       <m:oMath>
@@ -782,13 +1388,7 @@
         </m:r>
       </m:oMath>
       <w:r>
-        <w:t xml:space="preserve">,</w:t>
-      </w:r>
-      <w:r>
-        <w:t xml:space="preserve"> </w:t>
-      </w:r>
-      <w:r>
-        <w:t xml:space="preserve">so</w:t>
+        <w:t xml:space="preserve">, so</w:t>
       </w:r>
       <w:r>
         <w:t xml:space="preserve"> </w:t>
@@ -832,56 +1432,6 @@
         </m:r>
         <m:r>
           <m:t>0</m:t>
-        </m:r>
-      </m:oMath>
-      <w:r>
-        <w:t xml:space="preserve"> </w:t>
-      </w:r>
-      <w:r>
-        <w:t xml:space="preserve">and</w:t>
-      </w:r>
-      <w:r>
-        <w:t xml:space="preserve"> </w:t>
-      </w:r>
-      <m:oMath>
-        <m:r>
-          <m:rPr>
-            <m:sty m:val="p"/>
-          </m:rPr>
-          <m:t>sin</m:t>
-        </m:r>
-        <m:r>
-          <m:rPr>
-            <m:sty m:val="p"/>
-          </m:rPr>
-          <m:t>(</m:t>
-        </m:r>
-        <m:r>
-          <m:t>π</m:t>
-        </m:r>
-        <m:r>
-          <m:rPr>
-            <m:sty m:val="p"/>
-          </m:rPr>
-          <m:t>/</m:t>
-        </m:r>
-        <m:r>
-          <m:t>2</m:t>
-        </m:r>
-        <m:r>
-          <m:rPr>
-            <m:sty m:val="p"/>
-          </m:rPr>
-          <m:t>)</m:t>
-        </m:r>
-        <m:r>
-          <m:rPr>
-            <m:sty m:val="p"/>
-          </m:rPr>
-          <m:t>=</m:t>
-        </m:r>
-        <m:r>
-          <m:t>1</m:t>
         </m:r>
       </m:oMath>
       <w:r>
@@ -890,9 +1440,10 @@
     </w:p>
     <w:p>
       <w:pPr>
+        <w:pStyle w:val="Compact"/>
         <w:numPr>
           <w:ilvl w:val="0"/>
-          <w:numId w:val="1001"/>
+          <w:numId w:val="1002"/>
         </w:numPr>
       </w:pPr>
       <m:oMath>
@@ -1093,6 +1644,42 @@
         <w:t xml:space="preserve"> </w:t>
       </w:r>
       <m:oMath>
+        <m:r>
+          <m:rPr>
+            <m:sty m:val="p"/>
+          </m:rPr>
+          <m:t>cos</m:t>
+        </m:r>
+        <m:r>
+          <m:rPr>
+            <m:sty m:val="p"/>
+          </m:rPr>
+          <m:t>(</m:t>
+        </m:r>
+        <m:r>
+          <m:t>π</m:t>
+        </m:r>
+        <m:r>
+          <m:rPr>
+            <m:sty m:val="p"/>
+          </m:rPr>
+          <m:t>/</m:t>
+        </m:r>
+        <m:r>
+          <m:t>4</m:t>
+        </m:r>
+        <m:r>
+          <m:rPr>
+            <m:sty m:val="p"/>
+          </m:rPr>
+          <m:t>)</m:t>
+        </m:r>
+        <m:r>
+          <m:rPr>
+            <m:sty m:val="p"/>
+          </m:rPr>
+          <m:t>=</m:t>
+        </m:r>
         <m:sSub>
           <m:e>
             <m:r>
@@ -1145,133 +1732,8 @@
         </m:r>
       </m:oMath>
       <w:r>
-        <w:t xml:space="preserve">:</w:t>
-      </w:r>
-    </w:p>
-    <w:p>
-      <w:pPr>
-        <w:pStyle w:val="BodyText"/>
-      </w:pPr>
-      <m:oMathPara>
-        <m:oMathParaPr>
-          <m:jc m:val="center"/>
-        </m:oMathParaPr>
-        <m:oMath>
-          <m:eqArr>
-            <m:e>
-              <m:r>
-                <m:rPr>
-                  <m:sty m:val="p"/>
-                </m:rPr>
-                <m:t>cos</m:t>
-              </m:r>
-              <m:r>
-                <m:rPr>
-                  <m:sty m:val="p"/>
-                </m:rPr>
-                <m:t>(</m:t>
-              </m:r>
-              <m:r>
-                <m:t>π</m:t>
-              </m:r>
-              <m:r>
-                <m:rPr>
-                  <m:sty m:val="p"/>
-                </m:rPr>
-                <m:t>/</m:t>
-              </m:r>
-              <m:r>
-                <m:t>4</m:t>
-              </m:r>
-              <m:r>
-                <m:rPr>
-                  <m:sty m:val="p"/>
-                </m:rPr>
-                <m:t>)</m:t>
-              </m:r>
-              <m:r>
-                <m:t>&amp;</m:t>
-              </m:r>
-              <m:r>
-                <m:rPr>
-                  <m:sty m:val="p"/>
-                </m:rPr>
-                <m:t>=</m:t>
-              </m:r>
-              <m:r>
-                <m:rPr>
-                  <m:sty m:val="p"/>
-                </m:rPr>
-                <m:t>sin</m:t>
-              </m:r>
-              <m:r>
-                <m:rPr>
-                  <m:sty m:val="p"/>
-                </m:rPr>
-                <m:t>(</m:t>
-              </m:r>
-              <m:r>
-                <m:t>π</m:t>
-              </m:r>
-              <m:r>
-                <m:rPr>
-                  <m:sty m:val="p"/>
-                </m:rPr>
-                <m:t>/</m:t>
-              </m:r>
-              <m:r>
-                <m:t>4</m:t>
-              </m:r>
-              <m:r>
-                <m:rPr>
-                  <m:sty m:val="p"/>
-                </m:rPr>
-                <m:t>)</m:t>
-              </m:r>
-            </m:e>
-            <m:e>
-              <m:r>
-                <m:t>&amp;</m:t>
-              </m:r>
-              <m:r>
-                <m:rPr>
-                  <m:sty m:val="p"/>
-                </m:rPr>
-                <m:t>=</m:t>
-              </m:r>
-              <m:f>
-                <m:fPr>
-                  <m:type m:val="lin"/>
-                </m:fPr>
-                <m:num>
-                  <m:r>
-                    <m:t>1</m:t>
-                  </m:r>
-                </m:num>
-                <m:den>
-                  <m:rad>
-                    <m:radPr>
-                      <m:degHide m:val="on"/>
-                    </m:radPr>
-                    <m:deg/>
-                    <m:e>
-                      <m:r>
-                        <m:t>2</m:t>
-                      </m:r>
-                    </m:e>
-                  </m:rad>
-                </m:den>
-              </m:f>
-              <m:r>
-                <m:rPr>
-                  <m:sty m:val="p"/>
-                </m:rPr>
-                <m:t>.</m:t>
-              </m:r>
-            </m:e>
-          </m:eqArr>
-        </m:oMath>
-      </m:oMathPara>
+        <w:t xml:space="preserve">.</w:t>
+      </w:r>
     </w:p>
     <w:p>
       <w:pPr>
@@ -1405,11 +1867,677 @@
         <w:t xml:space="preserve">degrees.</w:t>
       </w:r>
     </w:p>
-    <w:bookmarkEnd w:id="10"/>
-    <w:bookmarkStart w:id="11" w:name="thm-cosine-sine-identity"/>
+    <w:bookmarkEnd w:id="14"/>
+    <w:bookmarkStart w:id="15" w:name="def-sine"/>
     <w:p>
       <w:pPr>
         <w:pStyle w:val="BodyText"/>
+      </w:pPr>
+      <w:r>
+        <w:rPr>
+          <w:b/>
+          <w:bCs/>
+        </w:rPr>
+        <w:t xml:space="preserve">Definition 4 (Sine)</w:t>
+      </w:r>
+      <w:r>
+        <w:t xml:space="preserve"> </w:t>
+      </w:r>
+      <w:r>
+        <w:t xml:space="preserve">For a real number</w:t>
+      </w:r>
+      <w:r>
+        <w:t xml:space="preserve"> </w:t>
+      </w:r>
+      <m:oMath>
+        <m:r>
+          <m:t>θ</m:t>
+        </m:r>
+      </m:oMath>
+      <w:r>
+        <w:t xml:space="preserve">, the second coordinate of the point reached from</w:t>
+      </w:r>
+      <w:r>
+        <w:t xml:space="preserve"> </w:t>
+      </w:r>
+      <m:oMath>
+        <m:r>
+          <m:rPr>
+            <m:sty m:val="p"/>
+          </m:rPr>
+          <m:t>(</m:t>
+        </m:r>
+        <m:r>
+          <m:t>1</m:t>
+        </m:r>
+        <m:r>
+          <m:rPr>
+            <m:sty m:val="p"/>
+          </m:rPr>
+          <m:t>,</m:t>
+        </m:r>
+        <m:r>
+          <m:t>0</m:t>
+        </m:r>
+        <m:r>
+          <m:rPr>
+            <m:sty m:val="p"/>
+          </m:rPr>
+          <m:t>)</m:t>
+        </m:r>
+      </m:oMath>
+      <w:r>
+        <w:t xml:space="preserve"> </w:t>
+      </w:r>
+      <w:r>
+        <w:t xml:space="preserve">by moving a distance</w:t>
+      </w:r>
+      <w:r>
+        <w:t xml:space="preserve"> </w:t>
+      </w:r>
+      <m:oMath>
+        <m:r>
+          <m:t>​</m:t>
+        </m:r>
+        <m:d>
+          <m:dPr>
+            <m:begChr m:val="|"/>
+            <m:sepChr m:val=""/>
+            <m:endChr m:val="|"/>
+            <m:grow/>
+          </m:dPr>
+          <m:e>
+            <m:r>
+              <m:t>θ</m:t>
+            </m:r>
+          </m:e>
+        </m:d>
+        <m:r>
+          <m:t>​</m:t>
+        </m:r>
+      </m:oMath>
+      <w:r>
+        <w:t xml:space="preserve"> </w:t>
+      </w:r>
+      <w:r>
+        <w:t xml:space="preserve">along the unit circle (</w:t>
+      </w:r>
+      <w:hyperlink w:anchor="def-cosine-sine">
+        <w:r>
+          <w:rPr>
+            <w:rStyle w:val="Hyperlink"/>
+          </w:rPr>
+          <w:t xml:space="preserve">Definition 3</w:t>
+        </w:r>
+      </w:hyperlink>
+      <w:r>
+        <w:t xml:space="preserve">)</w:t>
+      </w:r>
+      <w:r>
+        <w:t xml:space="preserve"> </w:t>
+      </w:r>
+      <w:r>
+        <w:t xml:space="preserve">is the</w:t>
+      </w:r>
+      <w:r>
+        <w:t xml:space="preserve"> </w:t>
+      </w:r>
+      <w:r>
+        <w:rPr>
+          <w:b/>
+          <w:bCs/>
+        </w:rPr>
+        <w:t xml:space="preserve">sine</w:t>
+      </w:r>
+      <w:r>
+        <w:t xml:space="preserve"> </w:t>
+      </w:r>
+      <w:r>
+        <w:t xml:space="preserve">of</w:t>
+      </w:r>
+      <w:r>
+        <w:t xml:space="preserve"> </w:t>
+      </w:r>
+      <m:oMath>
+        <m:r>
+          <m:t>θ</m:t>
+        </m:r>
+      </m:oMath>
+      <w:r>
+        <w:t xml:space="preserve">, written</w:t>
+      </w:r>
+      <w:r>
+        <w:t xml:space="preserve"> </w:t>
+      </w:r>
+      <m:oMath>
+        <m:r>
+          <m:rPr>
+            <m:sty m:val="p"/>
+          </m:rPr>
+          <m:t>sin</m:t>
+        </m:r>
+        <m:r>
+          <m:t>θ</m:t>
+        </m:r>
+      </m:oMath>
+      <w:r>
+        <w:t xml:space="preserve">.</w:t>
+      </w:r>
+    </w:p>
+    <w:bookmarkEnd w:id="15"/>
+    <w:bookmarkStart w:id="16" w:name="exm-sine"/>
+    <w:p>
+      <w:pPr>
+        <w:pStyle w:val="BodyText"/>
+      </w:pPr>
+      <w:r>
+        <w:rPr>
+          <w:b/>
+          <w:bCs/>
+        </w:rPr>
+        <w:t xml:space="preserve">Example 4 (Sines of some angles)</w:t>
+      </w:r>
+      <w:r>
+        <w:t xml:space="preserve"> </w:t>
+      </w:r>
+      <w:r>
+        <w:t xml:space="preserve"> </w:t>
+      </w:r>
+    </w:p>
+    <w:p>
+      <w:pPr>
+        <w:pStyle w:val="Compact"/>
+        <w:numPr>
+          <w:ilvl w:val="0"/>
+          <w:numId w:val="1003"/>
+        </w:numPr>
+      </w:pPr>
+      <m:oMath>
+        <m:r>
+          <m:t>θ</m:t>
+        </m:r>
+        <m:r>
+          <m:rPr>
+            <m:sty m:val="p"/>
+          </m:rPr>
+          <m:t>=</m:t>
+        </m:r>
+        <m:r>
+          <m:t>0</m:t>
+        </m:r>
+      </m:oMath>
+      <w:r>
+        <w:t xml:space="preserve"> </w:t>
+      </w:r>
+      <w:r>
+        <w:t xml:space="preserve">stays at</w:t>
+      </w:r>
+      <w:r>
+        <w:t xml:space="preserve"> </w:t>
+      </w:r>
+      <m:oMath>
+        <m:r>
+          <m:rPr>
+            <m:sty m:val="p"/>
+          </m:rPr>
+          <m:t>(</m:t>
+        </m:r>
+        <m:r>
+          <m:t>1</m:t>
+        </m:r>
+        <m:r>
+          <m:rPr>
+            <m:sty m:val="p"/>
+          </m:rPr>
+          <m:t>,</m:t>
+        </m:r>
+        <m:r>
+          <m:t>0</m:t>
+        </m:r>
+        <m:r>
+          <m:rPr>
+            <m:sty m:val="p"/>
+          </m:rPr>
+          <m:t>)</m:t>
+        </m:r>
+      </m:oMath>
+      <w:r>
+        <w:t xml:space="preserve">, so</w:t>
+      </w:r>
+      <w:r>
+        <w:t xml:space="preserve"> </w:t>
+      </w:r>
+      <m:oMath>
+        <m:r>
+          <m:rPr>
+            <m:sty m:val="p"/>
+          </m:rPr>
+          <m:t>sin</m:t>
+        </m:r>
+        <m:r>
+          <m:t>0</m:t>
+        </m:r>
+        <m:r>
+          <m:rPr>
+            <m:sty m:val="p"/>
+          </m:rPr>
+          <m:t>=</m:t>
+        </m:r>
+        <m:r>
+          <m:t>0</m:t>
+        </m:r>
+      </m:oMath>
+      <w:r>
+        <w:t xml:space="preserve">.</w:t>
+      </w:r>
+    </w:p>
+    <w:p>
+      <w:pPr>
+        <w:pStyle w:val="Compact"/>
+        <w:numPr>
+          <w:ilvl w:val="0"/>
+          <w:numId w:val="1003"/>
+        </w:numPr>
+      </w:pPr>
+      <m:oMath>
+        <m:r>
+          <m:t>θ</m:t>
+        </m:r>
+        <m:r>
+          <m:rPr>
+            <m:sty m:val="p"/>
+          </m:rPr>
+          <m:t>=</m:t>
+        </m:r>
+        <m:r>
+          <m:t>π</m:t>
+        </m:r>
+      </m:oMath>
+      <w:r>
+        <w:t xml:space="preserve"> </w:t>
+      </w:r>
+      <w:r>
+        <w:t xml:space="preserve">goes half way around the circle, to</w:t>
+      </w:r>
+      <w:r>
+        <w:t xml:space="preserve"> </w:t>
+      </w:r>
+      <m:oMath>
+        <m:r>
+          <m:rPr>
+            <m:sty m:val="p"/>
+          </m:rPr>
+          <m:t>(</m:t>
+        </m:r>
+        <m:r>
+          <m:rPr>
+            <m:sty m:val="p"/>
+          </m:rPr>
+          <m:t>−</m:t>
+        </m:r>
+        <m:r>
+          <m:t>1</m:t>
+        </m:r>
+        <m:r>
+          <m:rPr>
+            <m:sty m:val="p"/>
+          </m:rPr>
+          <m:t>,</m:t>
+        </m:r>
+        <m:r>
+          <m:t>0</m:t>
+        </m:r>
+        <m:r>
+          <m:rPr>
+            <m:sty m:val="p"/>
+          </m:rPr>
+          <m:t>)</m:t>
+        </m:r>
+      </m:oMath>
+      <w:r>
+        <w:t xml:space="preserve">, so</w:t>
+      </w:r>
+      <w:r>
+        <w:t xml:space="preserve"> </w:t>
+      </w:r>
+      <m:oMath>
+        <m:r>
+          <m:rPr>
+            <m:sty m:val="p"/>
+          </m:rPr>
+          <m:t>sin</m:t>
+        </m:r>
+        <m:r>
+          <m:t>π</m:t>
+        </m:r>
+        <m:r>
+          <m:rPr>
+            <m:sty m:val="p"/>
+          </m:rPr>
+          <m:t>=</m:t>
+        </m:r>
+        <m:r>
+          <m:t>0</m:t>
+        </m:r>
+      </m:oMath>
+      <w:r>
+        <w:t xml:space="preserve">.</w:t>
+      </w:r>
+    </w:p>
+    <w:p>
+      <w:pPr>
+        <w:pStyle w:val="Compact"/>
+        <w:numPr>
+          <w:ilvl w:val="0"/>
+          <w:numId w:val="1003"/>
+        </w:numPr>
+      </w:pPr>
+      <m:oMath>
+        <m:r>
+          <m:t>θ</m:t>
+        </m:r>
+        <m:r>
+          <m:rPr>
+            <m:sty m:val="p"/>
+          </m:rPr>
+          <m:t>=</m:t>
+        </m:r>
+        <m:r>
+          <m:t>π</m:t>
+        </m:r>
+        <m:r>
+          <m:rPr>
+            <m:sty m:val="p"/>
+          </m:rPr>
+          <m:t>/</m:t>
+        </m:r>
+        <m:r>
+          <m:t>2</m:t>
+        </m:r>
+      </m:oMath>
+      <w:r>
+        <w:t xml:space="preserve"> </w:t>
+      </w:r>
+      <w:r>
+        <w:t xml:space="preserve">goes a quarter of the way round, to</w:t>
+      </w:r>
+      <w:r>
+        <w:t xml:space="preserve"> </w:t>
+      </w:r>
+      <m:oMath>
+        <m:r>
+          <m:rPr>
+            <m:sty m:val="p"/>
+          </m:rPr>
+          <m:t>(</m:t>
+        </m:r>
+        <m:r>
+          <m:t>0</m:t>
+        </m:r>
+        <m:r>
+          <m:rPr>
+            <m:sty m:val="p"/>
+          </m:rPr>
+          <m:t>,</m:t>
+        </m:r>
+        <m:r>
+          <m:t>1</m:t>
+        </m:r>
+        <m:r>
+          <m:rPr>
+            <m:sty m:val="p"/>
+          </m:rPr>
+          <m:t>)</m:t>
+        </m:r>
+      </m:oMath>
+      <w:r>
+        <w:t xml:space="preserve">, so</w:t>
+      </w:r>
+      <w:r>
+        <w:t xml:space="preserve"> </w:t>
+      </w:r>
+      <m:oMath>
+        <m:r>
+          <m:rPr>
+            <m:sty m:val="p"/>
+          </m:rPr>
+          <m:t>sin</m:t>
+        </m:r>
+        <m:r>
+          <m:rPr>
+            <m:sty m:val="p"/>
+          </m:rPr>
+          <m:t>(</m:t>
+        </m:r>
+        <m:r>
+          <m:t>π</m:t>
+        </m:r>
+        <m:r>
+          <m:rPr>
+            <m:sty m:val="p"/>
+          </m:rPr>
+          <m:t>/</m:t>
+        </m:r>
+        <m:r>
+          <m:t>2</m:t>
+        </m:r>
+        <m:r>
+          <m:rPr>
+            <m:sty m:val="p"/>
+          </m:rPr>
+          <m:t>)</m:t>
+        </m:r>
+        <m:r>
+          <m:rPr>
+            <m:sty m:val="p"/>
+          </m:rPr>
+          <m:t>=</m:t>
+        </m:r>
+        <m:r>
+          <m:t>1</m:t>
+        </m:r>
+      </m:oMath>
+      <w:r>
+        <w:t xml:space="preserve">.</w:t>
+      </w:r>
+    </w:p>
+    <w:p>
+      <w:pPr>
+        <w:pStyle w:val="Compact"/>
+        <w:numPr>
+          <w:ilvl w:val="0"/>
+          <w:numId w:val="1003"/>
+        </w:numPr>
+      </w:pPr>
+      <m:oMath>
+        <m:r>
+          <m:t>θ</m:t>
+        </m:r>
+        <m:r>
+          <m:rPr>
+            <m:sty m:val="p"/>
+          </m:rPr>
+          <m:t>=</m:t>
+        </m:r>
+        <m:r>
+          <m:t>π</m:t>
+        </m:r>
+        <m:r>
+          <m:rPr>
+            <m:sty m:val="p"/>
+          </m:rPr>
+          <m:t>/</m:t>
+        </m:r>
+        <m:r>
+          <m:t>4</m:t>
+        </m:r>
+      </m:oMath>
+      <w:r>
+        <w:t xml:space="preserve"> </w:t>
+      </w:r>
+      <w:r>
+        <w:t xml:space="preserve">reaches the point with</w:t>
+      </w:r>
+      <w:r>
+        <w:t xml:space="preserve"> </w:t>
+      </w:r>
+      <m:oMath>
+        <m:sSub>
+          <m:e>
+            <m:r>
+              <m:t>x</m:t>
+            </m:r>
+          </m:e>
+          <m:sub>
+            <m:r>
+              <m:t>1</m:t>
+            </m:r>
+          </m:sub>
+        </m:sSub>
+        <m:r>
+          <m:rPr>
+            <m:sty m:val="p"/>
+          </m:rPr>
+          <m:t>=</m:t>
+        </m:r>
+        <m:sSub>
+          <m:e>
+            <m:r>
+              <m:t>x</m:t>
+            </m:r>
+          </m:e>
+          <m:sub>
+            <m:r>
+              <m:t>2</m:t>
+            </m:r>
+          </m:sub>
+        </m:sSub>
+        <m:r>
+          <m:rPr>
+            <m:sty m:val="p"/>
+          </m:rPr>
+          <m:t>=</m:t>
+        </m:r>
+        <m:f>
+          <m:fPr>
+            <m:type m:val="lin"/>
+          </m:fPr>
+          <m:num>
+            <m:r>
+              <m:t>1</m:t>
+            </m:r>
+          </m:num>
+          <m:den>
+            <m:rad>
+              <m:radPr>
+                <m:degHide m:val="on"/>
+              </m:radPr>
+              <m:deg/>
+              <m:e>
+                <m:r>
+                  <m:t>2</m:t>
+                </m:r>
+              </m:e>
+            </m:rad>
+          </m:den>
+        </m:f>
+      </m:oMath>
+      <w:r>
+        <w:t xml:space="preserve"> </w:t>
+      </w:r>
+      <w:r>
+        <w:t xml:space="preserve">(</w:t>
+      </w:r>
+      <w:hyperlink w:anchor="exm-cosine-sine">
+        <w:r>
+          <w:rPr>
+            <w:rStyle w:val="Hyperlink"/>
+          </w:rPr>
+          <w:t xml:space="preserve">Example 3</w:t>
+        </w:r>
+      </w:hyperlink>
+      <w:r>
+        <w:t xml:space="preserve">),</w:t>
+      </w:r>
+      <w:r>
+        <w:t xml:space="preserve"> </w:t>
+      </w:r>
+      <w:r>
+        <w:t xml:space="preserve">so</w:t>
+      </w:r>
+      <w:r>
+        <w:t xml:space="preserve"> </w:t>
+      </w:r>
+      <m:oMath>
+        <m:r>
+          <m:rPr>
+            <m:sty m:val="p"/>
+          </m:rPr>
+          <m:t>sin</m:t>
+        </m:r>
+        <m:r>
+          <m:rPr>
+            <m:sty m:val="p"/>
+          </m:rPr>
+          <m:t>(</m:t>
+        </m:r>
+        <m:r>
+          <m:t>π</m:t>
+        </m:r>
+        <m:r>
+          <m:rPr>
+            <m:sty m:val="p"/>
+          </m:rPr>
+          <m:t>/</m:t>
+        </m:r>
+        <m:r>
+          <m:t>4</m:t>
+        </m:r>
+        <m:r>
+          <m:rPr>
+            <m:sty m:val="p"/>
+          </m:rPr>
+          <m:t>)</m:t>
+        </m:r>
+        <m:r>
+          <m:rPr>
+            <m:sty m:val="p"/>
+          </m:rPr>
+          <m:t>=</m:t>
+        </m:r>
+        <m:f>
+          <m:fPr>
+            <m:type m:val="lin"/>
+          </m:fPr>
+          <m:num>
+            <m:r>
+              <m:t>1</m:t>
+            </m:r>
+          </m:num>
+          <m:den>
+            <m:rad>
+              <m:radPr>
+                <m:degHide m:val="on"/>
+              </m:radPr>
+              <m:deg/>
+              <m:e>
+                <m:r>
+                  <m:t>2</m:t>
+                </m:r>
+              </m:e>
+            </m:rad>
+          </m:den>
+        </m:f>
+      </m:oMath>
+      <w:r>
+        <w:t xml:space="preserve">.</w:t>
+      </w:r>
+    </w:p>
+    <w:bookmarkEnd w:id="16"/>
+    <w:bookmarkStart w:id="17" w:name="thm-cosine-sine-identity"/>
+    <w:p>
+      <w:pPr>
+        <w:pStyle w:val="FirstParagraph"/>
       </w:pPr>
       <w:r>
         <w:rPr>
@@ -1505,7 +2633,7 @@
         </m:oMath>
       </m:oMathPara>
     </w:p>
-    <w:bookmarkEnd w:id="11"/>
+    <w:bookmarkEnd w:id="17"/>
     <w:p>
       <w:pPr>
         <w:pStyle w:val="FirstParagraph"/>
@@ -1570,7 +2698,7 @@
       <w:r>
         <w:t xml:space="preserve">lies on the unit circle (</w:t>
       </w:r>
-      <w:hyperlink w:anchor="def-cosine-sine">
+      <w:hyperlink w:anchor="def-unit-circle">
         <w:r>
           <w:rPr>
             <w:rStyle w:val="Hyperlink"/>
@@ -1645,7 +2773,7 @@
         <w:t xml:space="preserve">.</w:t>
       </w:r>
     </w:p>
-    <w:bookmarkStart w:id="16" w:name="exm-cosine-sine-unit-circle"/>
+    <w:bookmarkStart w:id="22" w:name="exm-cosine-sine-unit-circle"/>
     <w:p>
       <w:pPr>
         <w:pStyle w:val="BodyText"/>
@@ -1655,7 +2783,7 @@
           <w:b/>
           <w:bCs/>
         </w:rPr>
-        <w:t xml:space="preserve">Example 2 (The unit circle and the angle</w:t>
+        <w:t xml:space="preserve">Example 5 (The unit circle and the angle</w:t>
       </w:r>
       <w:r>
         <w:rPr>
@@ -2409,7 +3537,7 @@
       <w:tr>
         <w:tc>
           <w:tcPr/>
-          <w:bookmarkStart w:id="15" w:name="fig-cosine-sine-unit-circle"/>
+          <w:bookmarkStart w:id="21" w:name="fig-cosine-sine-unit-circle"/>
           <w:p>
             <w:pPr>
               <w:jc w:val="center"/>
@@ -2419,18 +3547,18 @@
                 <wp:inline>
                   <wp:extent cx="4620126" cy="3696101"/>
                   <wp:effectExtent b="0" l="0" r="0" t="0"/>
-                  <wp:docPr descr="" title="" id="13" name="Picture"/>
+                  <wp:docPr descr="" title="" id="19" name="Picture"/>
                   <a:graphic>
                     <a:graphicData uri="http://schemas.openxmlformats.org/drawingml/2006/picture">
                       <pic:pic>
                         <pic:nvPicPr>
-                          <pic:cNvPr descr="algebra-trigonometry_files/figure-docx/unnamed-chunk-1-1.png" id="14" name="Picture"/>
+                          <pic:cNvPr descr="algebra-trigonometry_files/figure-docx/unnamed-chunk-1-1.png" id="20" name="Picture"/>
                           <pic:cNvPicPr>
                             <a:picLocks noChangeArrowheads="1" noChangeAspect="1"/>
                           </pic:cNvPicPr>
                         </pic:nvPicPr>
                         <pic:blipFill>
-                          <a:blip r:embed="rId12"/>
+                          <a:blip r:embed="rId18"/>
                           <a:stretch>
                             <a:fillRect/>
                           </a:stretch>
@@ -2496,12 +3624,12 @@
               <w:t xml:space="preserve">Its horizontal coordinate is the cosine and its vertical coordinate is the sine.</w:t>
             </w:r>
           </w:p>
-          <w:bookmarkEnd w:id="15"/>
+          <w:bookmarkEnd w:id="21"/>
         </w:tc>
       </w:tr>
     </w:tbl>
-    <w:bookmarkEnd w:id="16"/>
-    <w:bookmarkStart w:id="17" w:name="thm-cosine-bijection"/>
+    <w:bookmarkEnd w:id="22"/>
+    <w:bookmarkStart w:id="23" w:name="thm-cosine-bijection"/>
     <w:p>
       <w:pPr>
         <w:pStyle w:val="BodyText"/>
@@ -2878,7 +4006,7 @@
         <w:t xml:space="preserve">.</w:t>
       </w:r>
     </w:p>
-    <w:bookmarkEnd w:id="17"/>
+    <w:bookmarkEnd w:id="23"/>
     <w:p>
       <w:pPr>
         <w:pStyle w:val="BodyText"/>
@@ -3902,7 +5030,7 @@
         <w:t xml:space="preserve">, so it only decreases.</w:t>
       </w:r>
     </w:p>
-    <w:bookmarkEnd w:id="18"/>
+    <w:bookmarkEnd w:id="24"/>
     <w:sectPr>
       <w:footnotePr>
         <w:numRestart w:val="eachSect"/>
@@ -4120,6 +5248,12 @@
     <w:abstractNumId w:val="990"/>
   </w:num>
   <w:num w:numId="1001">
+    <w:abstractNumId w:val="991"/>
+  </w:num>
+  <w:num w:numId="1002">
+    <w:abstractNumId w:val="991"/>
+  </w:num>
+  <w:num w:numId="1003">
     <w:abstractNumId w:val="991"/>
   </w:num>
 </w:numbering>

</xml_diff>

<commit_message>
Deploying to gh-pages from @ Morrison-Lab/mds@574368cf47714240c8cb95b80633d82399e3fe75 🚀
</commit_message>
<xml_diff>
--- a/algebra-trigonometry.docx
+++ b/algebra-trigonometry.docx
@@ -15,10 +15,10 @@
         <w:pStyle w:val="Date"/>
       </w:pPr>
       <w:r>
-        <w:t xml:space="preserve">Last modified: 2026-10-19 02:15:55 (PDT)</w:t>
+        <w:t xml:space="preserve">Last modified: 2026-10-19 03:23:43 (PDT)</w:t>
       </w:r>
     </w:p>
-    <w:bookmarkStart w:id="35" w:name="sec-cosine-sine"/>
+    <w:bookmarkStart w:id="42" w:name="sec-cosine-sine"/>
     <w:p>
       <w:pPr>
         <w:pStyle w:val="Heading2"/>
@@ -916,7 +916,7 @@
       </w:r>
     </w:p>
     <w:bookmarkEnd w:id="12"/>
-    <w:bookmarkStart w:id="13" w:name="def-cosine-sine"/>
+    <w:bookmarkStart w:id="13" w:name="def-angle-unit-circle"/>
     <w:p>
       <w:pPr>
         <w:pStyle w:val="BodyText"/>
@@ -926,151 +926,92 @@
           <w:b/>
           <w:bCs/>
         </w:rPr>
-        <w:t xml:space="preserve">Definition 3 (Cosine)</w:t>
-      </w:r>
-      <w:r>
-        <w:t xml:space="preserve"> </w:t>
-      </w:r>
-      <w:r>
-        <w:t xml:space="preserve">For a real number</w:t>
-      </w:r>
-      <w:r>
-        <w:t xml:space="preserve"> </w:t>
-      </w:r>
-      <m:oMath>
-        <m:r>
-          <m:t>θ</m:t>
-        </m:r>
-      </m:oMath>
-      <w:r>
-        <w:t xml:space="preserve">, start at the point</w:t>
-      </w:r>
-      <w:r>
-        <w:t xml:space="preserve"> </w:t>
-      </w:r>
-      <m:oMath>
-        <m:r>
-          <m:rPr>
-            <m:sty m:val="p"/>
-          </m:rPr>
-          <m:t>(</m:t>
-        </m:r>
-        <m:r>
-          <m:t>1</m:t>
-        </m:r>
-        <m:r>
-          <m:rPr>
-            <m:sty m:val="p"/>
-          </m:rPr>
-          <m:t>,</m:t>
-        </m:r>
-        <m:r>
-          <m:t>0</m:t>
-        </m:r>
-        <m:r>
-          <m:rPr>
-            <m:sty m:val="p"/>
-          </m:rPr>
-          <m:t>)</m:t>
-        </m:r>
-      </m:oMath>
-      <w:r>
-        <w:t xml:space="preserve"> </w:t>
-      </w:r>
-      <w:r>
-        <w:t xml:space="preserve">of the unit circle (</w:t>
+        <w:t xml:space="preserve">Definition 3 (Angle on the unit circle)</w:t>
+      </w:r>
+      <w:r>
+        <w:t xml:space="preserve"> </w:t>
+      </w:r>
+      <w:r>
+        <w:t xml:space="preserve">The</w:t>
+      </w:r>
+      <w:r>
+        <w:t xml:space="preserve"> </w:t>
+      </w:r>
+      <w:r>
+        <w:rPr>
+          <w:b/>
+          <w:bCs/>
+        </w:rPr>
+        <w:t xml:space="preserve">angle</w:t>
+      </w:r>
+      <w:r>
+        <w:t xml:space="preserve"> </w:t>
+      </w:r>
+      <w:r>
+        <w:t xml:space="preserve">between two points of the</w:t>
+      </w:r>
+      <w:r>
+        <w:t xml:space="preserve"> </w:t>
       </w:r>
       <w:hyperlink w:anchor="def-unit-circle">
         <w:r>
           <w:rPr>
             <w:rStyle w:val="Hyperlink"/>
           </w:rPr>
-          <w:t xml:space="preserve">Definition 1</w:t>
+          <w:t xml:space="preserve">unit circle</w:t>
         </w:r>
       </w:hyperlink>
       <w:r>
-        <w:t xml:space="preserve">)</w:t>
-      </w:r>
-      <w:r>
-        <w:t xml:space="preserve"> </w:t>
-      </w:r>
-      <w:r>
-        <w:t xml:space="preserve">and move a distance</w:t>
-      </w:r>
-      <w:r>
-        <w:t xml:space="preserve"> </w:t>
-      </w:r>
-      <m:oMath>
-        <m:r>
-          <m:t>​</m:t>
-        </m:r>
-        <m:d>
-          <m:dPr>
-            <m:begChr m:val="|"/>
-            <m:sepChr m:val=""/>
-            <m:endChr m:val="|"/>
-            <m:grow/>
-          </m:dPr>
-          <m:e>
-            <m:r>
-              <m:t>θ</m:t>
-            </m:r>
-          </m:e>
-        </m:d>
-        <m:r>
-          <m:t>​</m:t>
-        </m:r>
-      </m:oMath>
-      <w:r>
-        <w:t xml:space="preserve"> </w:t>
-      </w:r>
-      <w:r>
-        <w:t xml:space="preserve">along the circle,</w:t>
-      </w:r>
-      <w:r>
-        <w:t xml:space="preserve"> </w:t>
-      </w:r>
-      <w:r>
-        <w:t xml:space="preserve">counterclockwise if</w:t>
-      </w:r>
-      <w:r>
-        <w:t xml:space="preserve"> </w:t>
-      </w:r>
-      <m:oMath>
-        <m:r>
-          <m:t>θ</m:t>
-        </m:r>
-        <m:r>
-          <m:rPr>
-            <m:sty m:val="p"/>
-          </m:rPr>
-          <m:t>≥</m:t>
+        <w:t xml:space="preserve"> </w:t>
+      </w:r>
+      <w:r>
+        <w:t xml:space="preserve">is how far apart they are along the circle, going the short way round.</w:t>
+      </w:r>
+      <w:r>
+        <w:t xml:space="preserve"> </w:t>
+      </w:r>
+      <w:r>
+        <w:t xml:space="preserve">Let the counterclockwise distance from the first point to the second be</w:t>
+      </w:r>
+      <w:r>
+        <w:t xml:space="preserve"> </w:t>
+      </w:r>
+      <m:oMath>
+        <m:r>
+          <m:t>s</m:t>
+        </m:r>
+        <m:r>
+          <m:rPr>
+            <m:sty m:val="p"/>
+          </m:rPr>
+          <m:t>∈</m:t>
+        </m:r>
+        <m:r>
+          <m:rPr>
+            <m:sty m:val="p"/>
+          </m:rPr>
+          <m:t>[</m:t>
         </m:r>
         <m:r>
           <m:t>0</m:t>
         </m:r>
-      </m:oMath>
-      <w:r>
-        <w:t xml:space="preserve"> </w:t>
-      </w:r>
-      <w:r>
-        <w:t xml:space="preserve">and clockwise if</w:t>
-      </w:r>
-      <w:r>
-        <w:t xml:space="preserve"> </w:t>
-      </w:r>
-      <m:oMath>
-        <m:r>
-          <m:t>θ</m:t>
-        </m:r>
-        <m:r>
-          <m:rPr>
-            <m:sty m:val="p"/>
-          </m:rPr>
-          <m:t>&lt;</m:t>
-        </m:r>
-        <m:r>
-          <m:t>0</m:t>
+        <m:r>
+          <m:rPr>
+            <m:sty m:val="p"/>
+          </m:rPr>
+          <m:t>,</m:t>
+        </m:r>
+        <m:r>
+          <m:t>2</m:t>
+        </m:r>
+        <m:r>
+          <m:t>π</m:t>
+        </m:r>
+        <m:r>
+          <m:rPr>
+            <m:sty m:val="p"/>
+          </m:rPr>
+          <m:t>)</m:t>
         </m:r>
       </m:oMath>
       <w:r>
@@ -1080,71 +1021,155 @@
         <w:t xml:space="preserve"> </w:t>
       </w:r>
       <w:r>
-        <w:t xml:space="preserve">The first coordinate of the point reached is the</w:t>
-      </w:r>
-      <w:r>
-        <w:t xml:space="preserve"> </w:t>
-      </w:r>
+        <w:t xml:space="preserve">Then the angle is</w:t>
+      </w:r>
+    </w:p>
+    <w:p>
+      <w:pPr>
+        <w:pStyle w:val="BodyText"/>
+      </w:pPr>
+      <m:oMathPara>
+        <m:oMathParaPr>
+          <m:jc m:val="center"/>
+        </m:oMathParaPr>
+        <m:oMath>
+          <m:r>
+            <m:t>θ</m:t>
+          </m:r>
+          <m:limUpp>
+            <m:e>
+              <m:r>
+                <m:rPr>
+                  <m:sty m:val="p"/>
+                </m:rPr>
+                <m:t>=</m:t>
+              </m:r>
+            </m:e>
+            <m:lim>
+              <m:r>
+                <m:rPr>
+                  <m:nor/>
+                  <m:sty m:val="p"/>
+                </m:rPr>
+                <m:t>def</m:t>
+              </m:r>
+            </m:lim>
+          </m:limUpp>
+          <m:r>
+            <m:rPr>
+              <m:sty m:val="p"/>
+            </m:rPr>
+            <m:t>min</m:t>
+          </m:r>
+          <m:r>
+            <m:t>​</m:t>
+          </m:r>
+          <m:d>
+            <m:dPr>
+              <m:begChr m:val="{"/>
+              <m:sepChr m:val=""/>
+              <m:endChr m:val="}"/>
+              <m:grow/>
+            </m:dPr>
+            <m:e>
+              <m:r>
+                <m:t>s</m:t>
+              </m:r>
+              <m:r>
+                <m:rPr>
+                  <m:sty m:val="p"/>
+                </m:rPr>
+                <m:t>,</m:t>
+              </m:r>
+              <m:r>
+                <m:t>2</m:t>
+              </m:r>
+              <m:r>
+                <m:t>π</m:t>
+              </m:r>
+              <m:r>
+                <m:rPr>
+                  <m:sty m:val="p"/>
+                </m:rPr>
+                <m:t>−</m:t>
+              </m:r>
+              <m:r>
+                <m:t>s</m:t>
+              </m:r>
+            </m:e>
+          </m:d>
+          <m:r>
+            <m:t>​</m:t>
+          </m:r>
+          <m:r>
+            <m:rPr>
+              <m:sty m:val="p"/>
+            </m:rPr>
+            <m:t>.</m:t>
+          </m:r>
+        </m:oMath>
+      </m:oMathPara>
+    </w:p>
+    <w:p>
+      <w:pPr>
+        <w:pStyle w:val="FirstParagraph"/>
+      </w:pPr>
+      <w:r>
+        <w:t xml:space="preserve">In words, the angle is the smaller of two distances from the first point to the second:</w:t>
+      </w:r>
+      <w:r>
+        <w:t xml:space="preserve"> </w:t>
+      </w:r>
+      <w:r>
+        <w:t xml:space="preserve">the counterclockwise one,</w:t>
+      </w:r>
+      <w:r>
+        <w:t xml:space="preserve"> </w:t>
+      </w:r>
+      <m:oMath>
+        <m:r>
+          <m:t>s</m:t>
+        </m:r>
+      </m:oMath>
+      <w:r>
+        <w:t xml:space="preserve">, or the clockwise one,</w:t>
+      </w:r>
+      <w:r>
+        <w:t xml:space="preserve"> </w:t>
+      </w:r>
+      <m:oMath>
+        <m:r>
+          <m:t>2</m:t>
+        </m:r>
+        <m:r>
+          <m:t>π</m:t>
+        </m:r>
+        <m:r>
+          <m:rPr>
+            <m:sty m:val="p"/>
+          </m:rPr>
+          <m:t>−</m:t>
+        </m:r>
+        <m:r>
+          <m:t>s</m:t>
+        </m:r>
+      </m:oMath>
+      <w:r>
+        <w:t xml:space="preserve">.</w:t>
+      </w:r>
+    </w:p>
+    <w:bookmarkEnd w:id="13"/>
+    <w:bookmarkStart w:id="14" w:name="exm-angle-unit-circle"/>
+    <w:p>
+      <w:pPr>
+        <w:pStyle w:val="BodyText"/>
+      </w:pPr>
       <w:r>
         <w:rPr>
           <w:b/>
           <w:bCs/>
         </w:rPr>
-        <w:t xml:space="preserve">cosine</w:t>
-      </w:r>
-      <w:r>
-        <w:t xml:space="preserve"> </w:t>
-      </w:r>
-      <w:r>
-        <w:t xml:space="preserve">of</w:t>
-      </w:r>
-      <w:r>
-        <w:t xml:space="preserve"> </w:t>
-      </w:r>
-      <m:oMath>
-        <m:r>
-          <m:t>θ</m:t>
-        </m:r>
-      </m:oMath>
-      <w:r>
-        <w:t xml:space="preserve"> </w:t>
-      </w:r>
-      <w:r>
-        <w:t xml:space="preserve">[3]</w:t>
-      </w:r>
-      <w:r>
-        <w:t xml:space="preserve">, written</w:t>
-      </w:r>
-      <w:r>
-        <w:t xml:space="preserve"> </w:t>
-      </w:r>
-      <m:oMath>
-        <m:r>
-          <m:rPr>
-            <m:sty m:val="p"/>
-          </m:rPr>
-          <m:t>cos</m:t>
-        </m:r>
-        <m:r>
-          <m:t>θ</m:t>
-        </m:r>
-      </m:oMath>
-      <w:r>
-        <w:t xml:space="preserve">.</w:t>
-      </w:r>
-    </w:p>
-    <w:bookmarkEnd w:id="13"/>
-    <w:bookmarkStart w:id="14" w:name="exm-cosine-sine"/>
-    <w:p>
-      <w:pPr>
-        <w:pStyle w:val="BodyText"/>
-      </w:pPr>
-      <w:r>
-        <w:rPr>
-          <w:b/>
-          <w:bCs/>
-        </w:rPr>
-        <w:t xml:space="preserve">Example 3 (Cosines of some angles)</w:t>
+        <w:t xml:space="preserve">Example 3 (Three angles on the unit circle)</w:t>
       </w:r>
       <w:r>
         <w:t xml:space="preserve"> </w:t>
@@ -1161,25 +1186,40 @@
           <w:numId w:val="1002"/>
         </w:numPr>
       </w:pPr>
-      <m:oMath>
-        <m:r>
-          <m:t>θ</m:t>
-        </m:r>
-        <m:r>
-          <m:rPr>
-            <m:sty m:val="p"/>
-          </m:rPr>
-          <m:t>=</m:t>
+      <w:r>
+        <w:t xml:space="preserve">The points</w:t>
+      </w:r>
+      <w:r>
+        <w:t xml:space="preserve"> </w:t>
+      </w:r>
+      <m:oMath>
+        <m:r>
+          <m:rPr>
+            <m:sty m:val="p"/>
+          </m:rPr>
+          <m:t>(</m:t>
+        </m:r>
+        <m:r>
+          <m:t>1</m:t>
+        </m:r>
+        <m:r>
+          <m:rPr>
+            <m:sty m:val="p"/>
+          </m:rPr>
+          <m:t>,</m:t>
         </m:r>
         <m:r>
           <m:t>0</m:t>
         </m:r>
-      </m:oMath>
-      <w:r>
-        <w:t xml:space="preserve"> </w:t>
-      </w:r>
-      <w:r>
-        <w:t xml:space="preserve">stays at</w:t>
+        <m:r>
+          <m:rPr>
+            <m:sty m:val="p"/>
+          </m:rPr>
+          <m:t>)</m:t>
+        </m:r>
+      </m:oMath>
+      <w:r>
+        <w:t xml:space="preserve">,</w:t>
       </w:r>
       <w:r>
         <w:t xml:space="preserve"> </w:t>
@@ -1192,48 +1232,62 @@
           <m:t>(</m:t>
         </m:r>
         <m:r>
+          <m:t>0</m:t>
+        </m:r>
+        <m:r>
+          <m:rPr>
+            <m:sty m:val="p"/>
+          </m:rPr>
+          <m:t>,</m:t>
+        </m:r>
+        <m:r>
           <m:t>1</m:t>
         </m:r>
         <m:r>
           <m:rPr>
             <m:sty m:val="p"/>
           </m:rPr>
-          <m:t>,</m:t>
-        </m:r>
-        <m:r>
-          <m:t>0</m:t>
-        </m:r>
-        <m:r>
-          <m:rPr>
-            <m:sty m:val="p"/>
-          </m:rPr>
           <m:t>)</m:t>
         </m:r>
       </m:oMath>
       <w:r>
-        <w:t xml:space="preserve">, so</w:t>
-      </w:r>
-      <w:r>
-        <w:t xml:space="preserve"> </w:t>
-      </w:r>
-      <m:oMath>
-        <m:r>
-          <m:rPr>
-            <m:sty m:val="p"/>
-          </m:rPr>
-          <m:t>cos</m:t>
-        </m:r>
-        <m:r>
-          <m:t>0</m:t>
-        </m:r>
-        <m:r>
-          <m:rPr>
-            <m:sty m:val="p"/>
-          </m:rPr>
-          <m:t>=</m:t>
-        </m:r>
-        <m:r>
-          <m:t>1</m:t>
+        <w:t xml:space="preserve"> </w:t>
+      </w:r>
+      <w:r>
+        <w:t xml:space="preserve">are a quarter of the circle apart, so their</w:t>
+      </w:r>
+      <w:r>
+        <w:t xml:space="preserve"> </w:t>
+      </w:r>
+      <w:hyperlink w:anchor="def-angle-unit-circle">
+        <w:r>
+          <w:rPr>
+            <w:rStyle w:val="Hyperlink"/>
+          </w:rPr>
+          <w:t xml:space="preserve">angle</w:t>
+        </w:r>
+      </w:hyperlink>
+      <w:r>
+        <w:t xml:space="preserve"> </w:t>
+      </w:r>
+      <w:r>
+        <w:t xml:space="preserve">is</w:t>
+      </w:r>
+      <w:r>
+        <w:t xml:space="preserve"> </w:t>
+      </w:r>
+      <m:oMath>
+        <m:r>
+          <m:t>π</m:t>
+        </m:r>
+        <m:r>
+          <m:rPr>
+            <m:sty m:val="p"/>
+          </m:rPr>
+          <m:t>/</m:t>
+        </m:r>
+        <m:r>
+          <m:t>2</m:t>
         </m:r>
       </m:oMath>
       <w:r>
@@ -1248,91 +1302,88 @@
           <w:numId w:val="1002"/>
         </w:numPr>
       </w:pPr>
-      <m:oMath>
-        <m:r>
-          <m:t>θ</m:t>
-        </m:r>
-        <m:r>
-          <m:rPr>
-            <m:sty m:val="p"/>
-          </m:rPr>
-          <m:t>=</m:t>
-        </m:r>
+      <w:r>
+        <w:t xml:space="preserve">The points</w:t>
+      </w:r>
+      <w:r>
+        <w:t xml:space="preserve"> </w:t>
+      </w:r>
+      <m:oMath>
+        <m:r>
+          <m:rPr>
+            <m:sty m:val="p"/>
+          </m:rPr>
+          <m:t>(</m:t>
+        </m:r>
+        <m:r>
+          <m:t>1</m:t>
+        </m:r>
+        <m:r>
+          <m:rPr>
+            <m:sty m:val="p"/>
+          </m:rPr>
+          <m:t>,</m:t>
+        </m:r>
+        <m:r>
+          <m:t>0</m:t>
+        </m:r>
+        <m:r>
+          <m:rPr>
+            <m:sty m:val="p"/>
+          </m:rPr>
+          <m:t>)</m:t>
+        </m:r>
+      </m:oMath>
+      <w:r>
+        <w:t xml:space="preserve">,</w:t>
+      </w:r>
+      <w:r>
+        <w:t xml:space="preserve"> </w:t>
+      </w:r>
+      <m:oMath>
+        <m:r>
+          <m:rPr>
+            <m:sty m:val="p"/>
+          </m:rPr>
+          <m:t>(</m:t>
+        </m:r>
+        <m:r>
+          <m:rPr>
+            <m:sty m:val="p"/>
+          </m:rPr>
+          <m:t>−</m:t>
+        </m:r>
+        <m:r>
+          <m:t>1</m:t>
+        </m:r>
+        <m:r>
+          <m:rPr>
+            <m:sty m:val="p"/>
+          </m:rPr>
+          <m:t>,</m:t>
+        </m:r>
+        <m:r>
+          <m:t>0</m:t>
+        </m:r>
+        <m:r>
+          <m:rPr>
+            <m:sty m:val="p"/>
+          </m:rPr>
+          <m:t>)</m:t>
+        </m:r>
+      </m:oMath>
+      <w:r>
+        <w:t xml:space="preserve"> </w:t>
+      </w:r>
+      <w:r>
+        <w:t xml:space="preserve">are half of the circle apart, so their angle is</w:t>
+      </w:r>
+      <w:r>
+        <w:t xml:space="preserve"> </w:t>
+      </w:r>
+      <m:oMath>
         <m:r>
           <m:t>π</m:t>
-        </m:r>
-      </m:oMath>
-      <w:r>
-        <w:t xml:space="preserve"> </w:t>
-      </w:r>
-      <w:r>
-        <w:t xml:space="preserve">goes half way around the circle, to</w:t>
-      </w:r>
-      <w:r>
-        <w:t xml:space="preserve"> </w:t>
-      </w:r>
-      <m:oMath>
-        <m:r>
-          <m:rPr>
-            <m:sty m:val="p"/>
-          </m:rPr>
-          <m:t>(</m:t>
-        </m:r>
-        <m:r>
-          <m:rPr>
-            <m:sty m:val="p"/>
-          </m:rPr>
-          <m:t>−</m:t>
-        </m:r>
-        <m:r>
-          <m:t>1</m:t>
-        </m:r>
-        <m:r>
-          <m:rPr>
-            <m:sty m:val="p"/>
-          </m:rPr>
-          <m:t>,</m:t>
-        </m:r>
-        <m:r>
-          <m:t>0</m:t>
-        </m:r>
-        <m:r>
-          <m:rPr>
-            <m:sty m:val="p"/>
-          </m:rPr>
-          <m:t>)</m:t>
-        </m:r>
-      </m:oMath>
-      <w:r>
-        <w:t xml:space="preserve">, so</w:t>
-      </w:r>
-      <w:r>
-        <w:t xml:space="preserve"> </w:t>
-      </w:r>
-      <m:oMath>
-        <m:r>
-          <m:rPr>
-            <m:sty m:val="p"/>
-          </m:rPr>
-          <m:t>cos</m:t>
-        </m:r>
-        <m:r>
-          <m:t>π</m:t>
-        </m:r>
-        <m:r>
-          <m:rPr>
-            <m:sty m:val="p"/>
-          </m:rPr>
-          <m:t>=</m:t>
-        </m:r>
-        <m:r>
-          <m:rPr>
-            <m:sty m:val="p"/>
-          </m:rPr>
-          <m:t>−</m:t>
-        </m:r>
-        <m:r>
-          <m:t>1</m:t>
         </m:r>
       </m:oMath>
       <w:r>
@@ -1347,34 +1398,269 @@
           <w:numId w:val="1002"/>
         </w:numPr>
       </w:pPr>
+      <w:r>
+        <w:t xml:space="preserve">The point</w:t>
+      </w:r>
+      <w:r>
+        <w:t xml:space="preserve"> </w:t>
+      </w:r>
+      <m:oMath>
+        <m:r>
+          <m:rPr>
+            <m:sty m:val="p"/>
+          </m:rPr>
+          <m:t>(</m:t>
+        </m:r>
+        <m:r>
+          <m:t>1</m:t>
+        </m:r>
+        <m:r>
+          <m:rPr>
+            <m:sty m:val="p"/>
+          </m:rPr>
+          <m:t>,</m:t>
+        </m:r>
+        <m:r>
+          <m:t>0</m:t>
+        </m:r>
+        <m:r>
+          <m:rPr>
+            <m:sty m:val="p"/>
+          </m:rPr>
+          <m:t>)</m:t>
+        </m:r>
+      </m:oMath>
+      <w:r>
+        <w:t xml:space="preserve"> </w:t>
+      </w:r>
+      <w:r>
+        <w:t xml:space="preserve">is</w:t>
+      </w:r>
+      <w:r>
+        <w:t xml:space="preserve"> </w:t>
+      </w:r>
+      <m:oMath>
+        <m:r>
+          <m:t>0</m:t>
+        </m:r>
+      </m:oMath>
+      <w:r>
+        <w:t xml:space="preserve"> </w:t>
+      </w:r>
+      <w:r>
+        <w:t xml:space="preserve">apart from itself, so their angle is</w:t>
+      </w:r>
+      <w:r>
+        <w:t xml:space="preserve"> </w:t>
+      </w:r>
+      <m:oMath>
+        <m:r>
+          <m:t>0</m:t>
+        </m:r>
+      </m:oMath>
+      <w:r>
+        <w:t xml:space="preserve">.</w:t>
+      </w:r>
+    </w:p>
+    <w:bookmarkEnd w:id="14"/>
+    <w:bookmarkStart w:id="15" w:name="prp-angle-unit-circle-range"/>
+    <w:p>
+      <w:pPr>
+        <w:pStyle w:val="FirstParagraph"/>
+      </w:pPr>
+      <w:r>
+        <w:rPr>
+          <w:b/>
+          <w:bCs/>
+        </w:rPr>
+        <w:t xml:space="preserve">Proposition 1 (Range of an angle on the unit circle)</w:t>
+      </w:r>
+      <w:r>
+        <w:t xml:space="preserve"> </w:t>
+      </w:r>
+      <w:r>
+        <w:t xml:space="preserve">An</w:t>
+      </w:r>
+      <w:r>
+        <w:t xml:space="preserve"> </w:t>
+      </w:r>
+      <w:hyperlink w:anchor="def-angle-unit-circle">
+        <w:r>
+          <w:rPr>
+            <w:rStyle w:val="Hyperlink"/>
+          </w:rPr>
+          <w:t xml:space="preserve">angle</w:t>
+        </w:r>
+      </w:hyperlink>
+      <w:r>
+        <w:t xml:space="preserve"> </w:t>
+      </w:r>
+      <w:r>
+        <w:t xml:space="preserve">between two points of the</w:t>
+      </w:r>
+      <w:r>
+        <w:t xml:space="preserve"> </w:t>
+      </w:r>
+      <w:hyperlink w:anchor="def-unit-circle">
+        <w:r>
+          <w:rPr>
+            <w:rStyle w:val="Hyperlink"/>
+          </w:rPr>
+          <w:t xml:space="preserve">unit circle</w:t>
+        </w:r>
+      </w:hyperlink>
+      <w:r>
+        <w:t xml:space="preserve"> </w:t>
+      </w:r>
+      <w:r>
+        <w:t xml:space="preserve">is at least</w:t>
+      </w:r>
+      <w:r>
+        <w:t xml:space="preserve"> </w:t>
+      </w:r>
+      <m:oMath>
+        <m:r>
+          <m:t>0</m:t>
+        </m:r>
+      </m:oMath>
+      <w:r>
+        <w:t xml:space="preserve">, at most</w:t>
+      </w:r>
+      <w:r>
+        <w:t xml:space="preserve"> </w:t>
+      </w:r>
+      <m:oMath>
+        <m:r>
+          <m:t>π</m:t>
+        </m:r>
+      </m:oMath>
+      <w:r>
+        <w:t xml:space="preserve"> </w:t>
+      </w:r>
+      <w:r>
+        <w:t xml:space="preserve">(</w:t>
+      </w:r>
+      <w:hyperlink w:anchor="def-pi">
+        <w:r>
+          <w:rPr>
+            <w:rStyle w:val="Hyperlink"/>
+          </w:rPr>
+          <w:t xml:space="preserve">Definition 2</w:t>
+        </w:r>
+      </w:hyperlink>
+      <w:r>
+        <w:t xml:space="preserve">).</w:t>
+      </w:r>
+    </w:p>
+    <w:bookmarkEnd w:id="15"/>
+    <w:p>
+      <w:pPr>
+        <w:pStyle w:val="BodyText"/>
+      </w:pPr>
+      <w:r>
+        <w:rPr>
+          <w:i/>
+          <w:iCs/>
+        </w:rPr>
+        <w:t xml:space="preserve">Proof</w:t>
+      </w:r>
+      <w:r>
+        <w:t xml:space="preserve">. </w:t>
+      </w:r>
+      <w:r>
+        <w:t xml:space="preserve">The whole circle has length</w:t>
+      </w:r>
+      <w:r>
+        <w:t xml:space="preserve"> </w:t>
+      </w:r>
+      <m:oMath>
+        <m:r>
+          <m:t>2</m:t>
+        </m:r>
+        <m:r>
+          <m:t>π</m:t>
+        </m:r>
+      </m:oMath>
+      <w:r>
+        <w:t xml:space="preserve"> </w:t>
+      </w:r>
+      <w:r>
+        <w:t xml:space="preserve">(</w:t>
+      </w:r>
+      <w:hyperlink w:anchor="def-pi">
+        <w:r>
+          <w:rPr>
+            <w:rStyle w:val="Hyperlink"/>
+          </w:rPr>
+          <w:t xml:space="preserve">Definition 2</w:t>
+        </w:r>
+      </w:hyperlink>
+      <w:r>
+        <w:t xml:space="preserve">).</w:t>
+      </w:r>
+      <w:r>
+        <w:t xml:space="preserve"> </w:t>
+      </w:r>
+      <w:r>
+        <w:t xml:space="preserve">Going the short way round covers at most half of the circle, which is</w:t>
+      </w:r>
+      <w:r>
+        <w:t xml:space="preserve"> </w:t>
+      </w:r>
+      <m:oMath>
+        <m:r>
+          <m:t>π</m:t>
+        </m:r>
+      </m:oMath>
+      <w:r>
+        <w:t xml:space="preserve">.</w:t>
+      </w:r>
+      <w:r>
+        <w:t xml:space="preserve"> </w:t>
+      </w:r>
+      <w:r>
+        <w:t xml:space="preserve">A distance along the circle is at least</w:t>
+      </w:r>
+      <w:r>
+        <w:t xml:space="preserve"> </w:t>
+      </w:r>
+      <m:oMath>
+        <m:r>
+          <m:t>0</m:t>
+        </m:r>
+      </m:oMath>
+      <w:r>
+        <w:t xml:space="preserve">.</w:t>
+      </w:r>
+    </w:p>
+    <w:bookmarkStart w:id="16" w:name="def-cosine-sine"/>
+    <w:p>
+      <w:pPr>
+        <w:pStyle w:val="BodyText"/>
+      </w:pPr>
+      <w:r>
+        <w:rPr>
+          <w:b/>
+          <w:bCs/>
+        </w:rPr>
+        <w:t xml:space="preserve">Definition 4 (Cosine)</w:t>
+      </w:r>
+      <w:r>
+        <w:t xml:space="preserve"> </w:t>
+      </w:r>
+      <w:r>
+        <w:t xml:space="preserve">For a real number</w:t>
+      </w:r>
+      <w:r>
+        <w:t xml:space="preserve"> </w:t>
+      </w:r>
       <m:oMath>
         <m:r>
           <m:t>θ</m:t>
         </m:r>
-        <m:r>
-          <m:rPr>
-            <m:sty m:val="p"/>
-          </m:rPr>
-          <m:t>=</m:t>
-        </m:r>
-        <m:r>
-          <m:t>π</m:t>
-        </m:r>
-        <m:r>
-          <m:rPr>
-            <m:sty m:val="p"/>
-          </m:rPr>
-          <m:t>/</m:t>
-        </m:r>
-        <m:r>
-          <m:t>2</m:t>
-        </m:r>
-      </m:oMath>
-      <w:r>
-        <w:t xml:space="preserve"> </w:t>
-      </w:r>
-      <w:r>
-        <w:t xml:space="preserve">goes a quarter of the way round, to</w:t>
+      </m:oMath>
+      <w:r>
+        <w:t xml:space="preserve">, start at the point</w:t>
       </w:r>
       <w:r>
         <w:t xml:space="preserve"> </w:t>
@@ -1387,26 +1673,164 @@
           <m:t>(</m:t>
         </m:r>
         <m:r>
+          <m:t>1</m:t>
+        </m:r>
+        <m:r>
+          <m:rPr>
+            <m:sty m:val="p"/>
+          </m:rPr>
+          <m:t>,</m:t>
+        </m:r>
+        <m:r>
           <m:t>0</m:t>
         </m:r>
         <m:r>
           <m:rPr>
             <m:sty m:val="p"/>
           </m:rPr>
-          <m:t>,</m:t>
-        </m:r>
-        <m:r>
-          <m:t>1</m:t>
-        </m:r>
-        <m:r>
-          <m:rPr>
-            <m:sty m:val="p"/>
-          </m:rPr>
           <m:t>)</m:t>
         </m:r>
       </m:oMath>
       <w:r>
-        <w:t xml:space="preserve">, so</w:t>
+        <w:t xml:space="preserve"> </w:t>
+      </w:r>
+      <w:r>
+        <w:t xml:space="preserve">of the unit circle (</w:t>
+      </w:r>
+      <w:hyperlink w:anchor="def-unit-circle">
+        <w:r>
+          <w:rPr>
+            <w:rStyle w:val="Hyperlink"/>
+          </w:rPr>
+          <w:t xml:space="preserve">Definition 1</w:t>
+        </w:r>
+      </w:hyperlink>
+      <w:r>
+        <w:t xml:space="preserve">)</w:t>
+      </w:r>
+      <w:r>
+        <w:t xml:space="preserve"> </w:t>
+      </w:r>
+      <w:r>
+        <w:t xml:space="preserve">and move a distance</w:t>
+      </w:r>
+      <w:r>
+        <w:t xml:space="preserve"> </w:t>
+      </w:r>
+      <m:oMath>
+        <m:r>
+          <m:t>​</m:t>
+        </m:r>
+        <m:d>
+          <m:dPr>
+            <m:begChr m:val="|"/>
+            <m:sepChr m:val=""/>
+            <m:endChr m:val="|"/>
+            <m:grow/>
+          </m:dPr>
+          <m:e>
+            <m:r>
+              <m:t>θ</m:t>
+            </m:r>
+          </m:e>
+        </m:d>
+        <m:r>
+          <m:t>​</m:t>
+        </m:r>
+      </m:oMath>
+      <w:r>
+        <w:t xml:space="preserve"> </w:t>
+      </w:r>
+      <w:r>
+        <w:t xml:space="preserve">along the circle,</w:t>
+      </w:r>
+      <w:r>
+        <w:t xml:space="preserve"> </w:t>
+      </w:r>
+      <w:r>
+        <w:t xml:space="preserve">counterclockwise if</w:t>
+      </w:r>
+      <w:r>
+        <w:t xml:space="preserve"> </w:t>
+      </w:r>
+      <m:oMath>
+        <m:r>
+          <m:t>θ</m:t>
+        </m:r>
+        <m:r>
+          <m:rPr>
+            <m:sty m:val="p"/>
+          </m:rPr>
+          <m:t>≥</m:t>
+        </m:r>
+        <m:r>
+          <m:t>0</m:t>
+        </m:r>
+      </m:oMath>
+      <w:r>
+        <w:t xml:space="preserve"> </w:t>
+      </w:r>
+      <w:r>
+        <w:t xml:space="preserve">and clockwise if</w:t>
+      </w:r>
+      <w:r>
+        <w:t xml:space="preserve"> </w:t>
+      </w:r>
+      <m:oMath>
+        <m:r>
+          <m:t>θ</m:t>
+        </m:r>
+        <m:r>
+          <m:rPr>
+            <m:sty m:val="p"/>
+          </m:rPr>
+          <m:t>&lt;</m:t>
+        </m:r>
+        <m:r>
+          <m:t>0</m:t>
+        </m:r>
+      </m:oMath>
+      <w:r>
+        <w:t xml:space="preserve">.</w:t>
+      </w:r>
+      <w:r>
+        <w:t xml:space="preserve"> </w:t>
+      </w:r>
+      <w:r>
+        <w:t xml:space="preserve">The first coordinate of the point reached is the</w:t>
+      </w:r>
+      <w:r>
+        <w:t xml:space="preserve"> </w:t>
+      </w:r>
+      <w:r>
+        <w:rPr>
+          <w:b/>
+          <w:bCs/>
+        </w:rPr>
+        <w:t xml:space="preserve">cosine</w:t>
+      </w:r>
+      <w:r>
+        <w:t xml:space="preserve"> </w:t>
+      </w:r>
+      <w:r>
+        <w:t xml:space="preserve">of</w:t>
+      </w:r>
+      <w:r>
+        <w:t xml:space="preserve"> </w:t>
+      </w:r>
+      <m:oMath>
+        <m:r>
+          <m:t>θ</m:t>
+        </m:r>
+      </m:oMath>
+      <w:r>
+        <w:t xml:space="preserve"> </w:t>
+      </w:r>
+      <w:r>
+        <w:t xml:space="preserve">[3]</w:t>
+      </w:r>
+      <w:r>
+        <w:t xml:space="preserve">, written</w:t>
       </w:r>
       <w:r>
         <w:t xml:space="preserve"> </w:t>
@@ -1419,41 +1843,31 @@
           <m:t>cos</m:t>
         </m:r>
         <m:r>
-          <m:rPr>
-            <m:sty m:val="p"/>
-          </m:rPr>
-          <m:t>(</m:t>
-        </m:r>
-        <m:r>
-          <m:t>π</m:t>
-        </m:r>
-        <m:r>
-          <m:rPr>
-            <m:sty m:val="p"/>
-          </m:rPr>
-          <m:t>/</m:t>
-        </m:r>
-        <m:r>
-          <m:t>2</m:t>
-        </m:r>
-        <m:r>
-          <m:rPr>
-            <m:sty m:val="p"/>
-          </m:rPr>
-          <m:t>)</m:t>
-        </m:r>
-        <m:r>
-          <m:rPr>
-            <m:sty m:val="p"/>
-          </m:rPr>
-          <m:t>=</m:t>
-        </m:r>
-        <m:r>
-          <m:t>0</m:t>
+          <m:t>θ</m:t>
         </m:r>
       </m:oMath>
       <w:r>
         <w:t xml:space="preserve">.</w:t>
+      </w:r>
+    </w:p>
+    <w:bookmarkEnd w:id="16"/>
+    <w:bookmarkStart w:id="17" w:name="exm-cosine-sine"/>
+    <w:p>
+      <w:pPr>
+        <w:pStyle w:val="BodyText"/>
+      </w:pPr>
+      <w:r>
+        <w:rPr>
+          <w:b/>
+          <w:bCs/>
+        </w:rPr>
+        <w:t xml:space="preserve">Example 4 (Cosines of some angles)</w:t>
+      </w:r>
+      <w:r>
+        <w:t xml:space="preserve"> </w:t>
+      </w:r>
+      <w:r>
+        <w:t xml:space="preserve"> </w:t>
       </w:r>
     </w:p>
     <w:p>
@@ -1461,7 +1875,310 @@
         <w:pStyle w:val="Compact"/>
         <w:numPr>
           <w:ilvl w:val="0"/>
-          <w:numId w:val="1002"/>
+          <w:numId w:val="1003"/>
+        </w:numPr>
+      </w:pPr>
+      <m:oMath>
+        <m:r>
+          <m:t>θ</m:t>
+        </m:r>
+        <m:r>
+          <m:rPr>
+            <m:sty m:val="p"/>
+          </m:rPr>
+          <m:t>=</m:t>
+        </m:r>
+        <m:r>
+          <m:t>0</m:t>
+        </m:r>
+      </m:oMath>
+      <w:r>
+        <w:t xml:space="preserve"> </w:t>
+      </w:r>
+      <w:r>
+        <w:t xml:space="preserve">stays at</w:t>
+      </w:r>
+      <w:r>
+        <w:t xml:space="preserve"> </w:t>
+      </w:r>
+      <m:oMath>
+        <m:r>
+          <m:rPr>
+            <m:sty m:val="p"/>
+          </m:rPr>
+          <m:t>(</m:t>
+        </m:r>
+        <m:r>
+          <m:t>1</m:t>
+        </m:r>
+        <m:r>
+          <m:rPr>
+            <m:sty m:val="p"/>
+          </m:rPr>
+          <m:t>,</m:t>
+        </m:r>
+        <m:r>
+          <m:t>0</m:t>
+        </m:r>
+        <m:r>
+          <m:rPr>
+            <m:sty m:val="p"/>
+          </m:rPr>
+          <m:t>)</m:t>
+        </m:r>
+      </m:oMath>
+      <w:r>
+        <w:t xml:space="preserve">, so</w:t>
+      </w:r>
+      <w:r>
+        <w:t xml:space="preserve"> </w:t>
+      </w:r>
+      <m:oMath>
+        <m:r>
+          <m:rPr>
+            <m:sty m:val="p"/>
+          </m:rPr>
+          <m:t>cos</m:t>
+        </m:r>
+        <m:r>
+          <m:t>0</m:t>
+        </m:r>
+        <m:r>
+          <m:rPr>
+            <m:sty m:val="p"/>
+          </m:rPr>
+          <m:t>=</m:t>
+        </m:r>
+        <m:r>
+          <m:t>1</m:t>
+        </m:r>
+      </m:oMath>
+      <w:r>
+        <w:t xml:space="preserve">.</w:t>
+      </w:r>
+    </w:p>
+    <w:p>
+      <w:pPr>
+        <w:pStyle w:val="Compact"/>
+        <w:numPr>
+          <w:ilvl w:val="0"/>
+          <w:numId w:val="1003"/>
+        </w:numPr>
+      </w:pPr>
+      <m:oMath>
+        <m:r>
+          <m:t>θ</m:t>
+        </m:r>
+        <m:r>
+          <m:rPr>
+            <m:sty m:val="p"/>
+          </m:rPr>
+          <m:t>=</m:t>
+        </m:r>
+        <m:r>
+          <m:t>π</m:t>
+        </m:r>
+      </m:oMath>
+      <w:r>
+        <w:t xml:space="preserve"> </w:t>
+      </w:r>
+      <w:r>
+        <w:t xml:space="preserve">goes half way around the circle, to</w:t>
+      </w:r>
+      <w:r>
+        <w:t xml:space="preserve"> </w:t>
+      </w:r>
+      <m:oMath>
+        <m:r>
+          <m:rPr>
+            <m:sty m:val="p"/>
+          </m:rPr>
+          <m:t>(</m:t>
+        </m:r>
+        <m:r>
+          <m:rPr>
+            <m:sty m:val="p"/>
+          </m:rPr>
+          <m:t>−</m:t>
+        </m:r>
+        <m:r>
+          <m:t>1</m:t>
+        </m:r>
+        <m:r>
+          <m:rPr>
+            <m:sty m:val="p"/>
+          </m:rPr>
+          <m:t>,</m:t>
+        </m:r>
+        <m:r>
+          <m:t>0</m:t>
+        </m:r>
+        <m:r>
+          <m:rPr>
+            <m:sty m:val="p"/>
+          </m:rPr>
+          <m:t>)</m:t>
+        </m:r>
+      </m:oMath>
+      <w:r>
+        <w:t xml:space="preserve">, so</w:t>
+      </w:r>
+      <w:r>
+        <w:t xml:space="preserve"> </w:t>
+      </w:r>
+      <m:oMath>
+        <m:r>
+          <m:rPr>
+            <m:sty m:val="p"/>
+          </m:rPr>
+          <m:t>cos</m:t>
+        </m:r>
+        <m:r>
+          <m:t>π</m:t>
+        </m:r>
+        <m:r>
+          <m:rPr>
+            <m:sty m:val="p"/>
+          </m:rPr>
+          <m:t>=</m:t>
+        </m:r>
+        <m:r>
+          <m:rPr>
+            <m:sty m:val="p"/>
+          </m:rPr>
+          <m:t>−</m:t>
+        </m:r>
+        <m:r>
+          <m:t>1</m:t>
+        </m:r>
+      </m:oMath>
+      <w:r>
+        <w:t xml:space="preserve">.</w:t>
+      </w:r>
+    </w:p>
+    <w:p>
+      <w:pPr>
+        <w:pStyle w:val="Compact"/>
+        <w:numPr>
+          <w:ilvl w:val="0"/>
+          <w:numId w:val="1003"/>
+        </w:numPr>
+      </w:pPr>
+      <m:oMath>
+        <m:r>
+          <m:t>θ</m:t>
+        </m:r>
+        <m:r>
+          <m:rPr>
+            <m:sty m:val="p"/>
+          </m:rPr>
+          <m:t>=</m:t>
+        </m:r>
+        <m:r>
+          <m:t>π</m:t>
+        </m:r>
+        <m:r>
+          <m:rPr>
+            <m:sty m:val="p"/>
+          </m:rPr>
+          <m:t>/</m:t>
+        </m:r>
+        <m:r>
+          <m:t>2</m:t>
+        </m:r>
+      </m:oMath>
+      <w:r>
+        <w:t xml:space="preserve"> </w:t>
+      </w:r>
+      <w:r>
+        <w:t xml:space="preserve">goes a quarter of the way round, to</w:t>
+      </w:r>
+      <w:r>
+        <w:t xml:space="preserve"> </w:t>
+      </w:r>
+      <m:oMath>
+        <m:r>
+          <m:rPr>
+            <m:sty m:val="p"/>
+          </m:rPr>
+          <m:t>(</m:t>
+        </m:r>
+        <m:r>
+          <m:t>0</m:t>
+        </m:r>
+        <m:r>
+          <m:rPr>
+            <m:sty m:val="p"/>
+          </m:rPr>
+          <m:t>,</m:t>
+        </m:r>
+        <m:r>
+          <m:t>1</m:t>
+        </m:r>
+        <m:r>
+          <m:rPr>
+            <m:sty m:val="p"/>
+          </m:rPr>
+          <m:t>)</m:t>
+        </m:r>
+      </m:oMath>
+      <w:r>
+        <w:t xml:space="preserve">, so</w:t>
+      </w:r>
+      <w:r>
+        <w:t xml:space="preserve"> </w:t>
+      </w:r>
+      <m:oMath>
+        <m:r>
+          <m:rPr>
+            <m:sty m:val="p"/>
+          </m:rPr>
+          <m:t>cos</m:t>
+        </m:r>
+        <m:r>
+          <m:rPr>
+            <m:sty m:val="p"/>
+          </m:rPr>
+          <m:t>(</m:t>
+        </m:r>
+        <m:r>
+          <m:t>π</m:t>
+        </m:r>
+        <m:r>
+          <m:rPr>
+            <m:sty m:val="p"/>
+          </m:rPr>
+          <m:t>/</m:t>
+        </m:r>
+        <m:r>
+          <m:t>2</m:t>
+        </m:r>
+        <m:r>
+          <m:rPr>
+            <m:sty m:val="p"/>
+          </m:rPr>
+          <m:t>)</m:t>
+        </m:r>
+        <m:r>
+          <m:rPr>
+            <m:sty m:val="p"/>
+          </m:rPr>
+          <m:t>=</m:t>
+        </m:r>
+        <m:r>
+          <m:t>0</m:t>
+        </m:r>
+      </m:oMath>
+      <w:r>
+        <w:t xml:space="preserve">.</w:t>
+      </w:r>
+    </w:p>
+    <w:p>
+      <w:pPr>
+        <w:pStyle w:val="Compact"/>
+        <w:numPr>
+          <w:ilvl w:val="0"/>
+          <w:numId w:val="1003"/>
         </w:numPr>
       </w:pPr>
       <m:oMath>
@@ -1885,8 +2602,8 @@
         <w:t xml:space="preserve">degrees.</w:t>
       </w:r>
     </w:p>
-    <w:bookmarkEnd w:id="14"/>
-    <w:bookmarkStart w:id="15" w:name="def-sine"/>
+    <w:bookmarkEnd w:id="17"/>
+    <w:bookmarkStart w:id="18" w:name="def-sine"/>
     <w:p>
       <w:pPr>
         <w:pStyle w:val="BodyText"/>
@@ -1896,7 +2613,7 @@
           <w:b/>
           <w:bCs/>
         </w:rPr>
-        <w:t xml:space="preserve">Definition 4 (Sine)</w:t>
+        <w:t xml:space="preserve">Definition 5 (Sine)</w:t>
       </w:r>
       <w:r>
         <w:t xml:space="preserve"> </w:t>
@@ -1985,7 +2702,7 @@
           <w:rPr>
             <w:rStyle w:val="Hyperlink"/>
           </w:rPr>
-          <w:t xml:space="preserve">Definition 3</w:t>
+          <w:t xml:space="preserve">Definition 4</w:t>
         </w:r>
       </w:hyperlink>
       <w:r>
@@ -2063,8 +2780,8 @@
         <w:t xml:space="preserve">.</w:t>
       </w:r>
     </w:p>
-    <w:bookmarkEnd w:id="15"/>
-    <w:bookmarkStart w:id="16" w:name="exm-sine"/>
+    <w:bookmarkEnd w:id="18"/>
+    <w:bookmarkStart w:id="19" w:name="exm-sine"/>
     <w:p>
       <w:pPr>
         <w:pStyle w:val="BodyText"/>
@@ -2074,7 +2791,7 @@
           <w:b/>
           <w:bCs/>
         </w:rPr>
-        <w:t xml:space="preserve">Example 4 (Sines of some angles)</w:t>
+        <w:t xml:space="preserve">Example 5 (Sines of some angles)</w:t>
       </w:r>
       <w:r>
         <w:t xml:space="preserve"> </w:t>
@@ -2088,7 +2805,7 @@
         <w:pStyle w:val="Compact"/>
         <w:numPr>
           <w:ilvl w:val="0"/>
-          <w:numId w:val="1003"/>
+          <w:numId w:val="1004"/>
         </w:numPr>
       </w:pPr>
       <m:oMath>
@@ -2175,7 +2892,7 @@
         <w:pStyle w:val="Compact"/>
         <w:numPr>
           <w:ilvl w:val="0"/>
-          <w:numId w:val="1003"/>
+          <w:numId w:val="1004"/>
         </w:numPr>
       </w:pPr>
       <m:oMath>
@@ -2268,7 +2985,7 @@
         <w:pStyle w:val="Compact"/>
         <w:numPr>
           <w:ilvl w:val="0"/>
-          <w:numId w:val="1003"/>
+          <w:numId w:val="1004"/>
         </w:numPr>
       </w:pPr>
       <m:oMath>
@@ -2385,7 +3102,7 @@
         <w:pStyle w:val="Compact"/>
         <w:numPr>
           <w:ilvl w:val="0"/>
-          <w:numId w:val="1003"/>
+          <w:numId w:val="1004"/>
         </w:numPr>
       </w:pPr>
       <m:oMath>
@@ -2492,7 +3209,7 @@
           <w:rPr>
             <w:rStyle w:val="Hyperlink"/>
           </w:rPr>
-          <w:t xml:space="preserve">Example 3</w:t>
+          <w:t xml:space="preserve">Example 4</w:t>
         </w:r>
       </w:hyperlink>
       <w:r>
@@ -2572,8 +3289,8 @@
         <w:t xml:space="preserve">.</w:t>
       </w:r>
     </w:p>
-    <w:bookmarkEnd w:id="16"/>
-    <w:bookmarkStart w:id="17" w:name="thm-cosine-sine-identity"/>
+    <w:bookmarkEnd w:id="19"/>
+    <w:bookmarkStart w:id="20" w:name="thm-cosine-sine-identity"/>
     <w:p>
       <w:pPr>
         <w:pStyle w:val="FirstParagraph"/>
@@ -2678,7 +3395,7 @@
         </m:oMath>
       </m:oMathPara>
     </w:p>
-    <w:bookmarkEnd w:id="17"/>
+    <w:bookmarkEnd w:id="20"/>
     <w:p>
       <w:pPr>
         <w:pStyle w:val="FirstParagraph"/>
@@ -2818,7 +3535,7 @@
         <w:t xml:space="preserve">.</w:t>
       </w:r>
     </w:p>
-    <w:bookmarkStart w:id="22" w:name="exm-cosine-sine-unit-circle"/>
+    <w:bookmarkStart w:id="25" w:name="exm-cosine-sine-unit-circle"/>
     <w:p>
       <w:pPr>
         <w:pStyle w:val="BodyText"/>
@@ -2828,7 +3545,7 @@
           <w:b/>
           <w:bCs/>
         </w:rPr>
-        <w:t xml:space="preserve">Example 5 (The unit circle and the angle</w:t>
+        <w:t xml:space="preserve">Example 6 (The unit circle and the angle</w:t>
       </w:r>
       <w:r>
         <w:rPr>
@@ -3582,7 +4299,7 @@
       <w:tr>
         <w:tc>
           <w:tcPr/>
-          <w:bookmarkStart w:id="21" w:name="fig-cosine-sine-unit-circle"/>
+          <w:bookmarkStart w:id="24" w:name="fig-cosine-sine-unit-circle"/>
           <w:p>
             <w:pPr>
               <w:jc w:val="center"/>
@@ -3592,18 +4309,18 @@
                 <wp:inline>
                   <wp:extent cx="4620126" cy="3696101"/>
                   <wp:effectExtent b="0" l="0" r="0" t="0"/>
-                  <wp:docPr descr="" title="" id="19" name="Picture"/>
+                  <wp:docPr descr="" title="" id="22" name="Picture"/>
                   <a:graphic>
                     <a:graphicData uri="http://schemas.openxmlformats.org/drawingml/2006/picture">
                       <pic:pic>
                         <pic:nvPicPr>
-                          <pic:cNvPr descr="algebra-trigonometry_files/figure-docx/unnamed-chunk-1-1.png" id="20" name="Picture"/>
+                          <pic:cNvPr descr="algebra-trigonometry_files/figure-docx/unnamed-chunk-1-1.png" id="23" name="Picture"/>
                           <pic:cNvPicPr>
                             <a:picLocks noChangeArrowheads="1" noChangeAspect="1"/>
                           </pic:cNvPicPr>
                         </pic:nvPicPr>
                         <pic:blipFill>
-                          <a:blip r:embed="rId18"/>
+                          <a:blip r:embed="rId21"/>
                           <a:stretch>
                             <a:fillRect/>
                           </a:stretch>
@@ -3669,12 +4386,12 @@
               <w:t xml:space="preserve">Its horizontal coordinate is the cosine and its vertical coordinate is the sine.</w:t>
             </w:r>
           </w:p>
-          <w:bookmarkEnd w:id="21"/>
+          <w:bookmarkEnd w:id="24"/>
         </w:tc>
       </w:tr>
     </w:tbl>
-    <w:bookmarkEnd w:id="22"/>
-    <w:bookmarkStart w:id="23" w:name="thm-cosine-bijection"/>
+    <w:bookmarkEnd w:id="25"/>
+    <w:bookmarkStart w:id="26" w:name="thm-cosine-bijection"/>
     <w:p>
       <w:pPr>
         <w:pStyle w:val="BodyText"/>
@@ -4051,7 +4768,7 @@
         <w:t xml:space="preserve">.</w:t>
       </w:r>
     </w:p>
-    <w:bookmarkEnd w:id="23"/>
+    <w:bookmarkEnd w:id="26"/>
     <w:p>
       <w:pPr>
         <w:pStyle w:val="BodyText"/>
@@ -5075,8 +5792,602 @@
         <w:t xml:space="preserve">, so it only decreases.</w:t>
       </w:r>
     </w:p>
-    <w:bookmarkStart w:id="34" w:name="refs"/>
-    <w:bookmarkStart w:id="25" w:name="ref-wikipedia_unit_circle"/>
+    <w:bookmarkStart w:id="29" w:name="def-arccosine"/>
+    <w:p>
+      <w:pPr>
+        <w:pStyle w:val="BodyText"/>
+      </w:pPr>
+      <w:r>
+        <w:rPr>
+          <w:b/>
+          <w:bCs/>
+        </w:rPr>
+        <w:t xml:space="preserve">Definition 6 (Arccosine)</w:t>
+      </w:r>
+      <w:r>
+        <w:t xml:space="preserve"> </w:t>
+      </w:r>
+      <w:r>
+        <w:t xml:space="preserve">The</w:t>
+      </w:r>
+      <w:r>
+        <w:t xml:space="preserve"> </w:t>
+      </w:r>
+      <w:r>
+        <w:rPr>
+          <w:b/>
+          <w:bCs/>
+        </w:rPr>
+        <w:t xml:space="preserve">arccosine</w:t>
+      </w:r>
+      <w:r>
+        <w:t xml:space="preserve"> </w:t>
+      </w:r>
+      <m:oMath>
+        <m:r>
+          <m:rPr>
+            <m:sty m:val="p"/>
+          </m:rPr>
+          <m:t>arccos</m:t>
+        </m:r>
+        <m:r>
+          <m:rPr>
+            <m:sty m:val="p"/>
+          </m:rPr>
+          <m:t>:</m:t>
+        </m:r>
+        <m:r>
+          <m:rPr>
+            <m:sty m:val="p"/>
+          </m:rPr>
+          <m:t>[</m:t>
+        </m:r>
+        <m:r>
+          <m:rPr>
+            <m:sty m:val="p"/>
+          </m:rPr>
+          <m:t>−</m:t>
+        </m:r>
+        <m:r>
+          <m:t>1</m:t>
+        </m:r>
+        <m:r>
+          <m:rPr>
+            <m:sty m:val="p"/>
+          </m:rPr>
+          <m:t>,</m:t>
+        </m:r>
+        <m:r>
+          <m:t>1</m:t>
+        </m:r>
+        <m:r>
+          <m:rPr>
+            <m:sty m:val="p"/>
+          </m:rPr>
+          <m:t>]</m:t>
+        </m:r>
+        <m:r>
+          <m:rPr>
+            <m:sty m:val="p"/>
+          </m:rPr>
+          <m:t>→</m:t>
+        </m:r>
+        <m:r>
+          <m:rPr>
+            <m:sty m:val="p"/>
+          </m:rPr>
+          <m:t>[</m:t>
+        </m:r>
+        <m:r>
+          <m:t>0</m:t>
+        </m:r>
+        <m:r>
+          <m:rPr>
+            <m:sty m:val="p"/>
+          </m:rPr>
+          <m:t>,</m:t>
+        </m:r>
+        <m:r>
+          <m:t>π</m:t>
+        </m:r>
+        <m:r>
+          <m:rPr>
+            <m:sty m:val="p"/>
+          </m:rPr>
+          <m:t>]</m:t>
+        </m:r>
+      </m:oMath>
+      <w:r>
+        <w:t xml:space="preserve"> </w:t>
+      </w:r>
+      <w:r>
+        <w:t xml:space="preserve">is the</w:t>
+      </w:r>
+      <w:r>
+        <w:t xml:space="preserve"> </w:t>
+      </w:r>
+      <w:hyperlink r:id="rId27">
+        <w:r>
+          <w:rPr>
+            <w:rStyle w:val="Hyperlink"/>
+          </w:rPr>
+          <w:t xml:space="preserve">function</w:t>
+        </w:r>
+      </w:hyperlink>
+      <w:r>
+        <w:t xml:space="preserve"> </w:t>
+      </w:r>
+      <w:r>
+        <w:t xml:space="preserve">that sends each</w:t>
+      </w:r>
+      <w:r>
+        <w:t xml:space="preserve"> </w:t>
+      </w:r>
+      <w:hyperlink w:anchor="def-cosine-sine">
+        <w:r>
+          <w:rPr>
+            <w:rStyle w:val="Hyperlink"/>
+          </w:rPr>
+          <w:t xml:space="preserve">cosine</w:t>
+        </w:r>
+      </w:hyperlink>
+      <w:r>
+        <w:t xml:space="preserve">,</w:t>
+      </w:r>
+      <w:r>
+        <w:t xml:space="preserve"> </w:t>
+      </w:r>
+      <m:oMath>
+        <m:r>
+          <m:t>c</m:t>
+        </m:r>
+        <m:r>
+          <m:rPr>
+            <m:sty m:val="p"/>
+          </m:rPr>
+          <m:t>∈</m:t>
+        </m:r>
+        <m:r>
+          <m:rPr>
+            <m:sty m:val="p"/>
+          </m:rPr>
+          <m:t>[</m:t>
+        </m:r>
+        <m:r>
+          <m:rPr>
+            <m:sty m:val="p"/>
+          </m:rPr>
+          <m:t>−</m:t>
+        </m:r>
+        <m:r>
+          <m:t>1</m:t>
+        </m:r>
+        <m:r>
+          <m:rPr>
+            <m:sty m:val="p"/>
+          </m:rPr>
+          <m:t>,</m:t>
+        </m:r>
+        <m:r>
+          <m:t>1</m:t>
+        </m:r>
+        <m:r>
+          <m:rPr>
+            <m:sty m:val="p"/>
+          </m:rPr>
+          <m:t>]</m:t>
+        </m:r>
+      </m:oMath>
+      <w:r>
+        <w:t xml:space="preserve">,</w:t>
+      </w:r>
+      <w:r>
+        <w:t xml:space="preserve"> </w:t>
+      </w:r>
+      <w:r>
+        <w:t xml:space="preserve">to the one</w:t>
+      </w:r>
+      <w:r>
+        <w:t xml:space="preserve"> </w:t>
+      </w:r>
+      <w:hyperlink r:id="rId28">
+        <w:r>
+          <w:rPr>
+            <w:rStyle w:val="Hyperlink"/>
+          </w:rPr>
+          <w:t xml:space="preserve">real number</w:t>
+        </w:r>
+      </w:hyperlink>
+      <w:r>
+        <w:t xml:space="preserve"> </w:t>
+      </w:r>
+      <m:oMath>
+        <m:r>
+          <m:t>θ</m:t>
+        </m:r>
+        <m:r>
+          <m:rPr>
+            <m:sty m:val="p"/>
+          </m:rPr>
+          <m:t>∈</m:t>
+        </m:r>
+        <m:r>
+          <m:rPr>
+            <m:sty m:val="p"/>
+          </m:rPr>
+          <m:t>[</m:t>
+        </m:r>
+        <m:r>
+          <m:t>0</m:t>
+        </m:r>
+        <m:r>
+          <m:rPr>
+            <m:sty m:val="p"/>
+          </m:rPr>
+          <m:t>,</m:t>
+        </m:r>
+        <m:r>
+          <m:t>π</m:t>
+        </m:r>
+        <m:r>
+          <m:rPr>
+            <m:sty m:val="p"/>
+          </m:rPr>
+          <m:t>]</m:t>
+        </m:r>
+      </m:oMath>
+      <w:r>
+        <w:t xml:space="preserve"> </w:t>
+      </w:r>
+      <w:r>
+        <w:t xml:space="preserve">whose cosine is</w:t>
+      </w:r>
+      <w:r>
+        <w:t xml:space="preserve"> </w:t>
+      </w:r>
+      <m:oMath>
+        <m:r>
+          <m:t>c</m:t>
+        </m:r>
+      </m:oMath>
+      <w:r>
+        <w:t xml:space="preserve">.</w:t>
+      </w:r>
+      <w:r>
+        <w:t xml:space="preserve"> </w:t>
+      </w:r>
+      <w:r>
+        <w:t xml:space="preserve">By</w:t>
+      </w:r>
+      <w:r>
+        <w:t xml:space="preserve"> </w:t>
+      </w:r>
+      <w:hyperlink w:anchor="thm-cosine-bijection">
+        <w:r>
+          <w:rPr>
+            <w:rStyle w:val="Hyperlink"/>
+          </w:rPr>
+          <w:t xml:space="preserve">Theorem 2</w:t>
+        </w:r>
+      </w:hyperlink>
+      <w:r>
+        <w:t xml:space="preserve">, there is just one such</w:t>
+      </w:r>
+      <w:r>
+        <w:t xml:space="preserve"> </w:t>
+      </w:r>
+      <m:oMath>
+        <m:r>
+          <m:t>θ</m:t>
+        </m:r>
+      </m:oMath>
+      <w:r>
+        <w:t xml:space="preserve">.</w:t>
+      </w:r>
+    </w:p>
+    <w:bookmarkEnd w:id="29"/>
+    <w:bookmarkStart w:id="30" w:name="exm-arccosine"/>
+    <w:p>
+      <w:pPr>
+        <w:pStyle w:val="BodyText"/>
+      </w:pPr>
+      <w:r>
+        <w:rPr>
+          <w:b/>
+          <w:bCs/>
+        </w:rPr>
+        <w:t xml:space="preserve">Example 7 (Three arccosines)</w:t>
+      </w:r>
+      <w:r>
+        <w:t xml:space="preserve"> </w:t>
+      </w:r>
+      <w:r>
+        <w:t xml:space="preserve"> </w:t>
+      </w:r>
+    </w:p>
+    <w:p>
+      <w:pPr>
+        <w:pStyle w:val="Compact"/>
+        <w:numPr>
+          <w:ilvl w:val="0"/>
+          <w:numId w:val="1005"/>
+        </w:numPr>
+      </w:pPr>
+      <w:r>
+        <w:t xml:space="preserve">The</w:t>
+      </w:r>
+      <w:r>
+        <w:t xml:space="preserve"> </w:t>
+      </w:r>
+      <w:hyperlink w:anchor="def-arccosine">
+        <w:r>
+          <w:rPr>
+            <w:rStyle w:val="Hyperlink"/>
+          </w:rPr>
+          <w:t xml:space="preserve">arccosine</w:t>
+        </w:r>
+      </w:hyperlink>
+      <w:r>
+        <w:t xml:space="preserve"> </w:t>
+      </w:r>
+      <w:r>
+        <w:t xml:space="preserve">of one is</w:t>
+      </w:r>
+      <w:r>
+        <w:t xml:space="preserve"> </w:t>
+      </w:r>
+      <m:oMath>
+        <m:r>
+          <m:rPr>
+            <m:sty m:val="p"/>
+          </m:rPr>
+          <m:t>arccos</m:t>
+        </m:r>
+        <m:r>
+          <m:t>1</m:t>
+        </m:r>
+        <m:r>
+          <m:rPr>
+            <m:sty m:val="p"/>
+          </m:rPr>
+          <m:t>=</m:t>
+        </m:r>
+        <m:r>
+          <m:t>0</m:t>
+        </m:r>
+      </m:oMath>
+      <w:r>
+        <w:t xml:space="preserve">, because the</w:t>
+      </w:r>
+      <w:r>
+        <w:t xml:space="preserve"> </w:t>
+      </w:r>
+      <w:hyperlink w:anchor="def-cosine-sine">
+        <w:r>
+          <w:rPr>
+            <w:rStyle w:val="Hyperlink"/>
+          </w:rPr>
+          <w:t xml:space="preserve">cosine</w:t>
+        </w:r>
+      </w:hyperlink>
+      <w:r>
+        <w:t xml:space="preserve"> </w:t>
+      </w:r>
+      <w:r>
+        <w:t xml:space="preserve">of zero is</w:t>
+      </w:r>
+      <w:r>
+        <w:t xml:space="preserve"> </w:t>
+      </w:r>
+      <m:oMath>
+        <m:r>
+          <m:rPr>
+            <m:sty m:val="p"/>
+          </m:rPr>
+          <m:t>cos</m:t>
+        </m:r>
+        <m:r>
+          <m:t>0</m:t>
+        </m:r>
+        <m:r>
+          <m:rPr>
+            <m:sty m:val="p"/>
+          </m:rPr>
+          <m:t>=</m:t>
+        </m:r>
+        <m:r>
+          <m:t>1</m:t>
+        </m:r>
+      </m:oMath>
+      <w:r>
+        <w:t xml:space="preserve">.</w:t>
+      </w:r>
+    </w:p>
+    <w:p>
+      <w:pPr>
+        <w:pStyle w:val="Compact"/>
+        <w:numPr>
+          <w:ilvl w:val="0"/>
+          <w:numId w:val="1005"/>
+        </w:numPr>
+      </w:pPr>
+      <w:r>
+        <w:t xml:space="preserve">The arccosine of zero is</w:t>
+      </w:r>
+      <w:r>
+        <w:t xml:space="preserve"> </w:t>
+      </w:r>
+      <m:oMath>
+        <m:r>
+          <m:rPr>
+            <m:sty m:val="p"/>
+          </m:rPr>
+          <m:t>arccos</m:t>
+        </m:r>
+        <m:r>
+          <m:t>0</m:t>
+        </m:r>
+        <m:r>
+          <m:rPr>
+            <m:sty m:val="p"/>
+          </m:rPr>
+          <m:t>=</m:t>
+        </m:r>
+        <m:r>
+          <m:t>π</m:t>
+        </m:r>
+        <m:r>
+          <m:rPr>
+            <m:sty m:val="p"/>
+          </m:rPr>
+          <m:t>/</m:t>
+        </m:r>
+        <m:r>
+          <m:t>2</m:t>
+        </m:r>
+      </m:oMath>
+      <w:r>
+        <w:t xml:space="preserve">, because the cosine of a quarter turn is</w:t>
+      </w:r>
+      <w:r>
+        <w:t xml:space="preserve"> </w:t>
+      </w:r>
+      <m:oMath>
+        <m:r>
+          <m:rPr>
+            <m:sty m:val="p"/>
+          </m:rPr>
+          <m:t>cos</m:t>
+        </m:r>
+        <m:r>
+          <m:rPr>
+            <m:sty m:val="p"/>
+          </m:rPr>
+          <m:t>(</m:t>
+        </m:r>
+        <m:r>
+          <m:t>π</m:t>
+        </m:r>
+        <m:r>
+          <m:rPr>
+            <m:sty m:val="p"/>
+          </m:rPr>
+          <m:t>/</m:t>
+        </m:r>
+        <m:r>
+          <m:t>2</m:t>
+        </m:r>
+        <m:r>
+          <m:rPr>
+            <m:sty m:val="p"/>
+          </m:rPr>
+          <m:t>)</m:t>
+        </m:r>
+        <m:r>
+          <m:rPr>
+            <m:sty m:val="p"/>
+          </m:rPr>
+          <m:t>=</m:t>
+        </m:r>
+        <m:r>
+          <m:t>0</m:t>
+        </m:r>
+      </m:oMath>
+      <w:r>
+        <w:t xml:space="preserve">.</w:t>
+      </w:r>
+    </w:p>
+    <w:p>
+      <w:pPr>
+        <w:pStyle w:val="Compact"/>
+        <w:numPr>
+          <w:ilvl w:val="0"/>
+          <w:numId w:val="1005"/>
+        </w:numPr>
+      </w:pPr>
+      <w:r>
+        <w:t xml:space="preserve">The arccosine of minus one is</w:t>
+      </w:r>
+      <w:r>
+        <w:t xml:space="preserve"> </w:t>
+      </w:r>
+      <m:oMath>
+        <m:r>
+          <m:rPr>
+            <m:sty m:val="p"/>
+          </m:rPr>
+          <m:t>arccos</m:t>
+        </m:r>
+        <m:r>
+          <m:rPr>
+            <m:sty m:val="p"/>
+          </m:rPr>
+          <m:t>(</m:t>
+        </m:r>
+        <m:r>
+          <m:rPr>
+            <m:sty m:val="p"/>
+          </m:rPr>
+          <m:t>−</m:t>
+        </m:r>
+        <m:r>
+          <m:t>1</m:t>
+        </m:r>
+        <m:r>
+          <m:rPr>
+            <m:sty m:val="p"/>
+          </m:rPr>
+          <m:t>)</m:t>
+        </m:r>
+        <m:r>
+          <m:rPr>
+            <m:sty m:val="p"/>
+          </m:rPr>
+          <m:t>=</m:t>
+        </m:r>
+        <m:r>
+          <m:t>π</m:t>
+        </m:r>
+      </m:oMath>
+      <w:r>
+        <w:t xml:space="preserve">, because the cosine of a half turn is</w:t>
+      </w:r>
+      <w:r>
+        <w:t xml:space="preserve"> </w:t>
+      </w:r>
+      <m:oMath>
+        <m:r>
+          <m:rPr>
+            <m:sty m:val="p"/>
+          </m:rPr>
+          <m:t>cos</m:t>
+        </m:r>
+        <m:r>
+          <m:t>π</m:t>
+        </m:r>
+        <m:r>
+          <m:rPr>
+            <m:sty m:val="p"/>
+          </m:rPr>
+          <m:t>=</m:t>
+        </m:r>
+        <m:r>
+          <m:rPr>
+            <m:sty m:val="p"/>
+          </m:rPr>
+          <m:t>−</m:t>
+        </m:r>
+        <m:r>
+          <m:t>1</m:t>
+        </m:r>
+      </m:oMath>
+      <w:r>
+        <w:t xml:space="preserve">.</w:t>
+      </w:r>
+    </w:p>
+    <w:bookmarkEnd w:id="30"/>
+    <w:bookmarkStart w:id="41" w:name="refs"/>
+    <w:bookmarkStart w:id="32" w:name="ref-wikipedia_unit_circle"/>
     <w:p>
       <w:pPr>
         <w:pStyle w:val="Bibliography"/>
@@ -5123,7 +6434,7 @@
       <w:r>
         <w:t xml:space="preserve"> </w:t>
       </w:r>
-      <w:hyperlink r:id="rId24">
+      <w:hyperlink r:id="rId31">
         <w:r>
           <w:rPr>
             <w:rStyle w:val="Hyperlink"/>
@@ -5132,8 +6443,8 @@
         </w:r>
       </w:hyperlink>
     </w:p>
-    <w:bookmarkEnd w:id="25"/>
-    <w:bookmarkStart w:id="27" w:name="ref-wikipedia_pi"/>
+    <w:bookmarkEnd w:id="32"/>
+    <w:bookmarkStart w:id="34" w:name="ref-wikipedia_pi"/>
     <w:p>
       <w:pPr>
         <w:pStyle w:val="Bibliography"/>
@@ -5180,7 +6491,7 @@
       <w:r>
         <w:t xml:space="preserve"> </w:t>
       </w:r>
-      <w:hyperlink r:id="rId26">
+      <w:hyperlink r:id="rId33">
         <w:r>
           <w:rPr>
             <w:rStyle w:val="Hyperlink"/>
@@ -5189,8 +6500,8 @@
         </w:r>
       </w:hyperlink>
     </w:p>
-    <w:bookmarkEnd w:id="27"/>
-    <w:bookmarkStart w:id="29" w:name="ref-wikipedia_sine_and_cosine"/>
+    <w:bookmarkEnd w:id="34"/>
+    <w:bookmarkStart w:id="36" w:name="ref-wikipedia_sine_and_cosine"/>
     <w:p>
       <w:pPr>
         <w:pStyle w:val="Bibliography"/>
@@ -5237,7 +6548,7 @@
       <w:r>
         <w:t xml:space="preserve"> </w:t>
       </w:r>
-      <w:hyperlink r:id="rId28">
+      <w:hyperlink r:id="rId35">
         <w:r>
           <w:rPr>
             <w:rStyle w:val="Hyperlink"/>
@@ -5246,8 +6557,8 @@
         </w:r>
       </w:hyperlink>
     </w:p>
-    <w:bookmarkEnd w:id="29"/>
-    <w:bookmarkStart w:id="31" w:name="ref-wikipedia_trigonometric_functions"/>
+    <w:bookmarkEnd w:id="36"/>
+    <w:bookmarkStart w:id="38" w:name="ref-wikipedia_trigonometric_functions"/>
     <w:p>
       <w:pPr>
         <w:pStyle w:val="Bibliography"/>
@@ -5294,7 +6605,7 @@
       <w:r>
         <w:t xml:space="preserve"> </w:t>
       </w:r>
-      <w:hyperlink r:id="rId30">
+      <w:hyperlink r:id="rId37">
         <w:r>
           <w:rPr>
             <w:rStyle w:val="Hyperlink"/>
@@ -5303,8 +6614,8 @@
         </w:r>
       </w:hyperlink>
     </w:p>
-    <w:bookmarkEnd w:id="31"/>
-    <w:bookmarkStart w:id="33" w:name="X5a2f2f32a394dfa9ade54906000e256a4416e3c"/>
+    <w:bookmarkEnd w:id="38"/>
+    <w:bookmarkStart w:id="40" w:name="X5a2f2f32a394dfa9ade54906000e256a4416e3c"/>
     <w:p>
       <w:pPr>
         <w:pStyle w:val="Bibliography"/>
@@ -5351,7 +6662,7 @@
       <w:r>
         <w:t xml:space="preserve"> </w:t>
       </w:r>
-      <w:hyperlink r:id="rId32">
+      <w:hyperlink r:id="rId39">
         <w:r>
           <w:rPr>
             <w:rStyle w:val="Hyperlink"/>
@@ -5360,9 +6671,9 @@
         </w:r>
       </w:hyperlink>
     </w:p>
-    <w:bookmarkEnd w:id="33"/>
-    <w:bookmarkEnd w:id="34"/>
-    <w:bookmarkEnd w:id="35"/>
+    <w:bookmarkEnd w:id="40"/>
+    <w:bookmarkEnd w:id="41"/>
+    <w:bookmarkEnd w:id="42"/>
     <w:sectPr>
       <w:footnotePr>
         <w:numRestart w:val="eachSect"/>
@@ -5586,6 +6897,12 @@
     <w:abstractNumId w:val="991"/>
   </w:num>
   <w:num w:numId="1003">
+    <w:abstractNumId w:val="991"/>
+  </w:num>
+  <w:num w:numId="1004">
+    <w:abstractNumId w:val="991"/>
+  </w:num>
+  <w:num w:numId="1005">
     <w:abstractNumId w:val="991"/>
   </w:num>
 </w:numbering>

</xml_diff>